<commit_message>
Fix UAI_Integrations_Playbook: rebuild ServiceNow section from clean base
Previous commit (040e2ed) had OneDrive sync clobber the file between python-docx
save and git-add, resulting in 17 tables. Restored from 70c491a (42 tables) and
re-inserted Integration #7 ServiceNow section (T33-T38):
  - T34: Quick Reference — sync status, asset counts, what works/broken
  - T35: 7.1 Use Cases — CMDB gap detection, multi-source enrichment, IR context (today);
          geo reporting + user attribution (post BUG-002/003 fix)
  - T36: 7.2 Talk Track — Finding #2 gap demo (190 missing assets); avoid list for BUG-002
  - T37: 7.3 Discovery/Objections — 4 discovery Qs, 4 objections incl. blank field handling
  - T38: 7.4 Qualification Guide — personas, fit signals, close line

Co-Authored-By: Claude Sonnet 4.6 <noreply@anthropic.com>
</commit_message>
<xml_diff>
--- a/fixes/UAI_Integrations_Playbook.docx
+++ b/fixes/UAI_Integrations_Playbook.docx
@@ -14804,7 +14804,6 @@
         <w:gridCol w:w="4896"/>
       </w:tblGrid>
       <w:tr>
-        <w:trPr/>
         <w:tc>
           <w:tcPr>
             <w:tcW w:type="dxa" w:w="3600"/>
@@ -14818,7 +14817,7 @@
                 <w:color w:val="FFFFFF"/>
                 <w:sz w:val="20"/>
               </w:rPr>
-              <w:t>QUICK REFERENCE</w:t>
+              <w:t>QUICK REFERENCE — ServiceNow</w:t>
               <w:br/>
             </w:r>
             <w:r>
@@ -14832,7 +14831,6 @@
             </w:r>
             <w:r>
               <w:rPr>
-                <w:b w:val="0"/>
                 <w:color w:val="FFFFFF"/>
                 <w:sz w:val="16"/>
               </w:rPr>
@@ -14849,7 +14847,6 @@
             </w:r>
             <w:r>
               <w:rPr>
-                <w:b w:val="0"/>
                 <w:color w:val="FFFFFF"/>
                 <w:sz w:val="16"/>
               </w:rPr>
@@ -14866,7 +14863,6 @@
             </w:r>
             <w:r>
               <w:rPr>
-                <w:b w:val="0"/>
                 <w:color w:val="FFFFFF"/>
                 <w:sz w:val="16"/>
               </w:rPr>
@@ -14883,7 +14879,6 @@
             </w:r>
             <w:r>
               <w:rPr>
-                <w:b w:val="0"/>
                 <w:color w:val="FFFFFF"/>
                 <w:sz w:val="16"/>
               </w:rPr>
@@ -14900,11 +14895,10 @@
             </w:r>
             <w:r>
               <w:rPr>
-                <w:b w:val="0"/>
                 <w:color w:val="FFFFFF"/>
                 <w:sz w:val="16"/>
               </w:rPr>
-              <w:t>Basic Auth (username:password)</w:t>
+              <w:t>Basic Auth (SN_API_USER / SN_API_PASSWORD env vars)</w:t>
             </w:r>
             <w:r>
               <w:rPr>
@@ -14913,15 +14907,14 @@
                 <w:sz w:val="16"/>
               </w:rPr>
               <w:br/>
-              <w:t xml:space="preserve">Discovery Scope: </w:t>
-            </w:r>
-            <w:r>
-              <w:rPr>
-                <w:b w:val="0"/>
+              <w:t xml:space="preserve">Scope: </w:t>
+            </w:r>
+            <w:r>
+              <w:rPr>
                 <w:color w:val="FFFFFF"/>
                 <w:sz w:val="16"/>
               </w:rPr>
-              <w:t>19 CMDB CI classes — computers, VMs, servers, printers, routers, switches, WAPs, firewalls, etc.</w:t>
+              <w:t>19 CMDB CI classes — computers, VMs, servers, printers, network gear</w:t>
             </w:r>
             <w:r>
               <w:rPr>
@@ -14934,11 +14927,10 @@
             </w:r>
             <w:r>
               <w:rPr>
-                <w:b w:val="0"/>
                 <w:color w:val="FFFFFF"/>
                 <w:sz w:val="16"/>
               </w:rPr>
-              <w:t>~1,156 records (728 computers + 261 VMs + 11 win_server + 8 linux_server + 6 esx + 40 printers + 78 network)</w:t>
+              <w:t>~1,156 records from assets_luminary.xlsx v7 + 78 synthesized network records</w:t>
             </w:r>
             <w:r>
               <w:rPr>
@@ -14947,15 +14939,14 @@
                 <w:sz w:val="16"/>
               </w:rPr>
               <w:br/>
-              <w:t xml:space="preserve">UAI Sync Status: </w:t>
-            </w:r>
-            <w:r>
-              <w:rPr>
-                <w:b w:val="0"/>
+              <w:t xml:space="preserve">UAI Sync: </w:t>
+            </w:r>
+            <w:r>
+              <w:rPr>
                 <w:color w:val="FFFFFF"/>
                 <w:sz w:val="16"/>
               </w:rPr>
-              <w:t>Synced — 'Sync completed successfully' as of 2026-07-04</w:t>
+              <w:t>Synced — 'Sync completed successfully' 2026-07-04</w:t>
             </w:r>
             <w:r>
               <w:rPr>
@@ -14964,11 +14955,10 @@
                 <w:sz w:val="16"/>
               </w:rPr>
               <w:br/>
-              <w:t xml:space="preserve">IPAM Discovery: </w:t>
-            </w:r>
-            <w:r>
-              <w:rPr>
-                <w:b w:val="0"/>
+              <w:t xml:space="preserve">IPAM: </w:t>
+            </w:r>
+            <w:r>
+              <w:rPr>
                 <w:color w:val="FFFFFF"/>
                 <w:sz w:val="16"/>
               </w:rPr>
@@ -14985,13 +14975,12 @@
             </w:r>
             <w:r>
               <w:rPr>
-                <w:b w:val="0"/>
                 <w:color w:val="FFFFFF"/>
                 <w:sz w:val="16"/>
               </w:rPr>
-              <w:t>BUG-002 (Critical): reference fields as objects → location/manufacturer/model blank for all assets</w:t>
+              <w:t>BUG-002 (High): reference fields as objects → location/manufacturer/model blank for all 1,156 assets</w:t>
               <w:br/>
-              <w:t>BUG-001 (High): fqdn missing from cmdb_ci_computer $select (728 assets)</w:t>
+              <w:t>BUG-001 (High): fqdn missing from cmdb_ci_computer sysparm_fields (728 assets)</w:t>
             </w:r>
             <w:r>
               <w:rPr>
@@ -15000,15 +14989,14 @@
                 <w:sz w:val="16"/>
               </w:rPr>
               <w:br/>
-              <w:t xml:space="preserve">Demo Status: </w:t>
-            </w:r>
-            <w:r>
-              <w:rPr>
-                <w:b w:val="0"/>
+              <w:t xml:space="preserve">Demo: </w:t>
+            </w:r>
+            <w:r>
+              <w:rPr>
                 <w:color w:val="FFFFFF"/>
                 <w:sz w:val="16"/>
               </w:rPr>
-              <w:t>PARTIAL — basic inventory sync works; field gaps visible during demo</w:t>
+              <w:t>PARTIAL — basic inventory sync works; avoid demoing Location/Model/FQDN fields</w:t>
             </w:r>
           </w:p>
         </w:tc>
@@ -15025,7 +15013,7 @@
                 <w:color w:val="1B3A5C"/>
                 <w:sz w:val="18"/>
               </w:rPr>
-              <w:t>ServiceNow — What Works vs What's Broken</w:t>
+              <w:t>What Works vs What's Broken</w:t>
               <w:br/>
             </w:r>
             <w:r>
@@ -15053,7 +15041,7 @@
                 <w:sz w:val="16"/>
               </w:rPr>
               <w:br/>
-              <w:t>All VM instance fields incl. FQDN (no sysparm_fields restriction)</w:t>
+              <w:t>All VM/server fields incl. FQDN (no sysparm_fields restriction)</w:t>
             </w:r>
             <w:r>
               <w:rPr>
@@ -15062,7 +15050,7 @@
                 <w:sz w:val="16"/>
               </w:rPr>
               <w:br/>
-              <w:t>Win/Linux/ESX server records fully stored with all fields</w:t>
+              <w:t>863 assets correlated with CrowdStrike across sources</w:t>
             </w:r>
             <w:r>
               <w:rPr>
@@ -15071,15 +15059,6 @@
                 <w:sz w:val="16"/>
               </w:rPr>
               <w:br/>
-              <w:t>Cross-source correlation with CrowdStrike for 863 shared assets</w:t>
-            </w:r>
-            <w:r>
-              <w:rPr>
-                <w:b w:val="0"/>
-                <w:color w:val="1B5E20"/>
-                <w:sz w:val="16"/>
-              </w:rPr>
-              <w:br/>
               <w:t>Finding #2 demo: 190 assets in UAI not in ServiceNow CMDB</w:t>
             </w:r>
             <w:r>
@@ -15116,16 +15095,7 @@
                 <w:sz w:val="16"/>
               </w:rPr>
               <w:br/>
-              <w:t>assigned_to / Owner — in raw_provider_data only, not top-level UAI field (BUG-003)</w:t>
-            </w:r>
-            <w:r>
-              <w:rPr>
-                <w:b w:val="0"/>
-                <w:color w:val="C62828"/>
-                <w:sz w:val="16"/>
-              </w:rPr>
-              <w:br/>
-              <w:t>Network infra correlation — sfo-sw-01 names don't match lsys- assets (BUG-005)</w:t>
+              <w:t>Owner/Assigned To — raw_provider_data only, not top-level UAI field (BUG-003)</w:t>
             </w:r>
           </w:p>
         </w:tc>
@@ -15227,7 +15197,7 @@
                 <w:color w:val="FFFFFF"/>
                 <w:sz w:val="18"/>
               </w:rPr>
-              <w:t>USE CASES — AVAILABLE TODAY (post UAI integration, bugs non-blocking)</w:t>
+              <w:t>USE CASES — AVAILABLE TODAY</w:t>
             </w:r>
           </w:p>
         </w:tc>
@@ -15344,7 +15314,7 @@
                 <w:color w:val="000000"/>
                 <w:sz w:val="16"/>
               </w:rPr>
-              <w:t>IT teams discover assets via network monitoring, CrowdStrike, or Intune that are NOT in ServiceNow CMDB. Manual CMDB hygiene is error-prone.</w:t>
+              <w:t>IT teams discover assets via EDR/MDM that are NOT in ServiceNow CMDB. Manual CMDB hygiene is error-prone.</w:t>
             </w:r>
           </w:p>
         </w:tc>
@@ -15367,7 +15337,7 @@
                 <w:color w:val="000000"/>
                 <w:sz w:val="16"/>
               </w:rPr>
-              <w:t>UAI cross-correlates all vendor sources. Shows 190 Luminary assets visible in CrowdStrike/Intune/Mist but absent from ServiceNow. Exportable list for CMDB remediation.</w:t>
+              <w:t>UAI cross-correlates all vendor sources. Shows 190 Luminary assets visible in CrowdStrike/Intune/Mist but absent from ServiceNow. Exportable remediation list.</w:t>
             </w:r>
           </w:p>
         </w:tc>
@@ -15390,7 +15360,7 @@
                 <w:color w:val="000000"/>
                 <w:sz w:val="16"/>
               </w:rPr>
-              <w:t>How many network assets do you know about that aren't in your CMDB yet?</w:t>
+              <w:t>How many devices on your network aren't in your CMDB right now?</w:t>
             </w:r>
           </w:p>
         </w:tc>
@@ -15415,7 +15385,7 @@
                 <w:color w:val="1B3A5C"/>
                 <w:sz w:val="18"/>
               </w:rPr>
-              <w:t>UC-7B  ·  Multi-Source Asset Enrichment</w:t>
+              <w:t>UC-7B  ·  Multi-Source Enrichment</w:t>
             </w:r>
           </w:p>
         </w:tc>
@@ -15438,7 +15408,7 @@
                 <w:color w:val="000000"/>
                 <w:sz w:val="16"/>
               </w:rPr>
-              <w:t>ServiceNow CMDB has accurate CI records but lacks live network context (last seen, current IP, compliance posture).</w:t>
+              <w:t>ServiceNow CMDB has accurate CI records but lacks live network context (last seen, current IP, EDR posture).</w:t>
             </w:r>
           </w:p>
         </w:tc>
@@ -15461,7 +15431,7 @@
                 <w:color w:val="000000"/>
                 <w:sz w:val="16"/>
               </w:rPr>
-              <w:t>UAI merges ServiceNow inventory with CrowdStrike agent data and IPAM leases. ServiceNow assets gain real-time IP, MAC correlation, and compliance badges from EDR.</w:t>
+              <w:t>UAI merges ServiceNow inventory with CrowdStrike/Intune data. ServiceNow assets gain real-time IP correlation, compliance badges, and EDR status.</w:t>
             </w:r>
           </w:p>
         </w:tc>
@@ -15484,7 +15454,7 @@
                 <w:color w:val="000000"/>
                 <w:sz w:val="16"/>
               </w:rPr>
-              <w:t>When an incident fires, do you have to cross-reference ServiceNow with your network monitoring tool to get the full picture?</w:t>
+              <w:t>When an incident fires, how many tools do you open to get the full picture for one device?</w:t>
             </w:r>
           </w:p>
         </w:tc>
@@ -15532,7 +15502,7 @@
                 <w:color w:val="000000"/>
                 <w:sz w:val="16"/>
               </w:rPr>
-              <w:t>Security team receives a threat alert on IP 10.16.1.2 and needs to know the affected asset, owner, and CMDB status instantly.</w:t>
+              <w:t>SOC receives alert on IP 10.16.1.2 — needs affected asset, owner, and CMDB status instantly.</w:t>
             </w:r>
           </w:p>
         </w:tc>
@@ -15555,7 +15525,7 @@
                 <w:color w:val="000000"/>
                 <w:sz w:val="16"/>
               </w:rPr>
-              <w:t>UAI shows: hostname = lsys-blr-lap-0001, ServiceNow CI record, CrowdStrike agent, assigned to Nadia Lange (raw_provider_data). One pane-of-glass lookup.</w:t>
+              <w:t>UAI shows hostname = lsys-blr-lap-0001, ServiceNow CI record, CrowdStrike agent, raw assigned_to data. One pane-of-glass lookup.</w:t>
             </w:r>
           </w:p>
         </w:tc>
@@ -15578,7 +15548,7 @@
                 <w:color w:val="000000"/>
                 <w:sz w:val="16"/>
               </w:rPr>
-              <w:t>How long does it take your SOC to pivot from a raw IP address to the CMDB record for the affected asset?</w:t>
+              <w:t>How long does it take your SOC to pivot from a raw IP to the CMDB record?</w:t>
             </w:r>
           </w:p>
         </w:tc>
@@ -15618,16 +15588,6 @@
               <w:spacing w:before="0" w:after="0"/>
             </w:pPr>
             <w:r/>
-            <w:r>
-              <w:rPr>
-                <w:rFonts w:ascii="Calibri" w:hAnsi="Calibri"/>
-                <w:b/>
-                <w:i w:val="0"/>
-                <w:color w:val="FFFFFF"/>
-                <w:sz w:val="16"/>
-              </w:rPr>
-              <w:t>PROBLEM</w:t>
-            </w:r>
           </w:p>
         </w:tc>
         <w:tc>
@@ -15641,16 +15601,6 @@
               <w:spacing w:before="0" w:after="0"/>
             </w:pPr>
             <w:r/>
-            <w:r>
-              <w:rPr>
-                <w:rFonts w:ascii="Calibri" w:hAnsi="Calibri"/>
-                <w:b/>
-                <w:i w:val="0"/>
-                <w:color w:val="FFFFFF"/>
-                <w:sz w:val="16"/>
-              </w:rPr>
-              <w:t>WHAT UAI ADDS</w:t>
-            </w:r>
           </w:p>
         </w:tc>
         <w:tc>
@@ -15664,16 +15614,6 @@
               <w:spacing w:before="0" w:after="0"/>
             </w:pPr>
             <w:r/>
-            <w:r>
-              <w:rPr>
-                <w:rFonts w:ascii="Calibri" w:hAnsi="Calibri"/>
-                <w:b/>
-                <w:i w:val="0"/>
-                <w:color w:val="FFFFFF"/>
-                <w:sz w:val="16"/>
-              </w:rPr>
-              <w:t>CUSTOMER QUESTION ANSWERED</w:t>
-            </w:r>
           </w:p>
         </w:tc>
       </w:tr>
@@ -15697,7 +15637,7 @@
                 <w:color w:val="1B3A5C"/>
                 <w:sz w:val="18"/>
               </w:rPr>
-              <w:t>UC-7D  ·  CMDB Accuracy by Location / Region  [requires BUG-002 fix]</w:t>
+              <w:t>UC-7D  ·  Geo CMDB Reporting  [BUG-002 fix required]</w:t>
             </w:r>
           </w:p>
         </w:tc>
@@ -15720,7 +15660,7 @@
                 <w:color w:val="000000"/>
                 <w:sz w:val="16"/>
               </w:rPr>
-              <w:t>Assets show as located in 'Bangalore' in ServiceNow but UAI cannot currently display or filter by this because mock doesn't return plain-string location.</w:t>
+              <w:t>Assets show location 'Bangalore' in ServiceNow but UAI can't display or filter by this — mock returns reference objects, not strings.</w:t>
             </w:r>
           </w:p>
         </w:tc>
@@ -15743,7 +15683,7 @@
                 <w:color w:val="000000"/>
                 <w:sz w:val="16"/>
               </w:rPr>
-              <w:t>Once mock implements sysparm_display_value=true, all 1,156 ServiceNow assets will have location, manufacturer, and model populated in UAI — enabling geo-based CMDB reporting.</w:t>
+              <w:t>Once mock implements sysparm_display_value=true, all 1,156 assets get location, manufacturer, and model in UAI — enabling geo-based CMDB reporting.</w:t>
             </w:r>
           </w:p>
         </w:tc>
@@ -15766,7 +15706,7 @@
                 <w:color w:val="000000"/>
                 <w:sz w:val="16"/>
               </w:rPr>
-              <w:t>Do you need to report on hardware refresh requirements by site? Can you do that across ServiceNow + your other tooling today?</w:t>
+              <w:t>Can you report on hardware refresh requirements by site across ServiceNow + your other tooling?</w:t>
             </w:r>
           </w:p>
         </w:tc>
@@ -15791,7 +15731,7 @@
                 <w:color w:val="1B3A5C"/>
                 <w:sz w:val="18"/>
               </w:rPr>
-              <w:t>UC-7E  ·  Asset Owner Attribution  [requires BUG-003 fix]</w:t>
+              <w:t>UC-7E  ·  User Asset Attribution  [BUG-003 fix required]</w:t>
             </w:r>
           </w:p>
         </w:tc>
@@ -15814,7 +15754,7 @@
                 <w:color w:val="000000"/>
                 <w:sz w:val="16"/>
               </w:rPr>
-              <w:t>CMDB has assigned_to for every computer asset but UAI doesn't surface this as a queryable field. Cannot filter 'all assets owned by user X' from ServiceNow source.</w:t>
+              <w:t>CMDB has assigned_to for every computer but UAI doesn't surface it as a queryable field.</w:t>
             </w:r>
           </w:p>
         </w:tc>
@@ -15837,7 +15777,7 @@
                 <w:color w:val="000000"/>
                 <w:sz w:val="16"/>
               </w:rPr>
-              <w:t>Once UAI maps assigned_to → owner, IT can cross-correlate ServiceNow user assignments with CrowdStrike endpoint posture — e.g. 'which of Nadia Lange's assets are out of compliance?'</w:t>
+              <w:t>Once UAI maps assigned_to → owner, IT can cross-correlate ServiceNow user assignments with CrowdStrike compliance posture per person.</w:t>
             </w:r>
           </w:p>
         </w:tc>
@@ -15860,7 +15800,7 @@
                 <w:color w:val="000000"/>
                 <w:sz w:val="16"/>
               </w:rPr>
-              <w:t>Can your service desk pull a list of all assets assigned to a specific user across CrowdStrike AND ServiceNow in one query today?</w:t>
+              <w:t>Can your service desk pull all assets owned by a specific user across CrowdStrike AND ServiceNow in one query?</w:t>
             </w:r>
           </w:p>
         </w:tc>
@@ -15957,14 +15897,26 @@
             <w:tcW w:type="dxa" w:w="3264"/>
             <w:shd w:val="clear" w:color="auto" w:fill="FFF3CD"/>
           </w:tcPr>
-          <w:p/>
+          <w:p>
+            <w:pPr>
+              <w:jc w:val="left"/>
+              <w:spacing w:before="0" w:after="0"/>
+            </w:pPr>
+            <w:r/>
+          </w:p>
         </w:tc>
         <w:tc>
           <w:tcPr>
             <w:tcW w:type="dxa" w:w="3264"/>
             <w:shd w:val="clear" w:color="auto" w:fill="FFF3CD"/>
           </w:tcPr>
-          <w:p/>
+          <w:p>
+            <w:pPr>
+              <w:jc w:val="left"/>
+              <w:spacing w:before="0" w:after="0"/>
+            </w:pPr>
+            <w:r/>
+          </w:p>
         </w:tc>
       </w:tr>
       <w:tr>
@@ -15987,7 +15939,7 @@
                 <w:color w:val="000000"/>
                 <w:sz w:val="18"/>
               </w:rPr>
-              <w:t>Confirm ServiceNow_Job status</w:t>
+              <w:t>Confirm sync</w:t>
             </w:r>
           </w:p>
         </w:tc>
@@ -16005,12 +15957,12 @@
             <w:r>
               <w:rPr>
                 <w:rFonts w:ascii="Calibri" w:hAnsi="Calibri"/>
-                <w:b/>
-                <w:i w:val="0"/>
-                <w:color w:val="000000"/>
-                <w:sz w:val="18"/>
-              </w:rPr>
-              <w:t>In UAI → Discovery → Jobs → ServiceNow_Job → Status = Synced</w:t>
+                <w:b w:val="0"/>
+                <w:i w:val="0"/>
+                <w:color w:val="000000"/>
+                <w:sz w:val="16"/>
+              </w:rPr>
+              <w:t>ServiceNow_Job → Status = Synced in UAI Discovery → Jobs</w:t>
             </w:r>
           </w:p>
         </w:tc>
@@ -16048,7 +16000,7 @@
                 <w:color w:val="000000"/>
                 <w:sz w:val="18"/>
               </w:rPr>
-              <w:t>Verify asset count</w:t>
+              <w:t>Know the gap</w:t>
             </w:r>
           </w:p>
         </w:tc>
@@ -16066,12 +16018,12 @@
             <w:r>
               <w:rPr>
                 <w:rFonts w:ascii="Calibri" w:hAnsi="Calibri"/>
-                <w:b/>
-                <w:i w:val="0"/>
-                <w:color w:val="000000"/>
-                <w:sz w:val="18"/>
-              </w:rPr>
-              <w:t>UAI should show ~1,000+ assets with source=servicenow. If 0, check SN_API_USER/SN_API_PASSWORD env vars in App Runner.</w:t>
+                <w:b w:val="0"/>
+                <w:i w:val="0"/>
+                <w:color w:val="000000"/>
+                <w:sz w:val="16"/>
+              </w:rPr>
+              <w:t>Finding #2 is READY: ~190 assets in UAI not in ServiceNow. This is the primary demo hook.</w:t>
             </w:r>
           </w:p>
         </w:tc>
@@ -16109,7 +16061,7 @@
                 <w:color w:val="000000"/>
                 <w:sz w:val="18"/>
               </w:rPr>
-              <w:t>Know the CMDB gap story</w:t>
+              <w:t>Avoid blank fields</w:t>
             </w:r>
           </w:p>
         </w:tc>
@@ -16127,12 +16079,12 @@
             <w:r>
               <w:rPr>
                 <w:rFonts w:ascii="Calibri" w:hAnsi="Calibri"/>
-                <w:b/>
-                <w:i w:val="0"/>
-                <w:color w:val="000000"/>
-                <w:sz w:val="18"/>
-              </w:rPr>
-              <w:t>Finding #2 is READY: 190 assets in UAI not in ServiceNow. This is the primary demo hook.</w:t>
+                <w:b w:val="0"/>
+                <w:i w:val="0"/>
+                <w:color w:val="000000"/>
+                <w:sz w:val="16"/>
+              </w:rPr>
+              <w:t>Do NOT filter/group by Location, Manufacturer, or Model — these will be blank (BUG-002).</w:t>
             </w:r>
           </w:p>
         </w:tc>
@@ -16244,7 +16196,7 @@
                 <w:color w:val="000000"/>
                 <w:sz w:val="16"/>
               </w:rPr>
-              <w:t>Navigate to Universal Asset Insights → Assets tab. SAY: 'We pull from your ServiceNow CMDB — all CIs sync automatically.'</w:t>
+              <w:t>SAY: 'We pull from your ServiceNow CMDB — all CIs sync automatically.'</w:t>
             </w:r>
           </w:p>
         </w:tc>
@@ -16282,7 +16234,7 @@
                 <w:color w:val="000000"/>
                 <w:sz w:val="18"/>
               </w:rPr>
-              <w:t>Filter by source=servicenow</w:t>
+              <w:t>Filter source=servicenow</w:t>
             </w:r>
           </w:p>
         </w:tc>
@@ -16305,7 +16257,7 @@
                 <w:color w:val="000000"/>
                 <w:sz w:val="16"/>
               </w:rPr>
-              <w:t>Show ~1,000 ServiceNow-sourced assets with hostname, IP, OS. SAY: 'Every CMDB CI in ServiceNow is visible here as a UAI asset.'</w:t>
+              <w:t>Show ~1,000 assets with hostname, IP, OS. SAY: 'Every CMDB CI is visible here.'</w:t>
             </w:r>
           </w:p>
         </w:tc>
@@ -16343,7 +16295,7 @@
                 <w:color w:val="000000"/>
                 <w:sz w:val="18"/>
               </w:rPr>
-              <w:t>Open lsys-blr-lap-0001</w:t>
+              <w:t>Filter: CrowdStrike OR Intune</w:t>
             </w:r>
           </w:p>
         </w:tc>
@@ -16366,7 +16318,7 @@
                 <w:color w:val="000000"/>
                 <w:sz w:val="16"/>
               </w:rPr>
-              <w:t>Show source badges: servicenow + crowdstrike_falcon. SAY: 'UAI fuses ServiceNow CMDB with your EDR — one record per device.'</w:t>
+              <w:t>Show total ~1,800+ assets from combined sources.</w:t>
             </w:r>
           </w:p>
         </w:tc>
@@ -16404,7 +16356,7 @@
                 <w:color w:val="000000"/>
                 <w:sz w:val="18"/>
               </w:rPr>
-              <w:t>Show cross-source gap</w:t>
+              <w:t>Add NOT servicenow filter</w:t>
             </w:r>
           </w:p>
         </w:tc>
@@ -16427,7 +16379,7 @@
                 <w:color w:val="000000"/>
                 <w:sz w:val="16"/>
               </w:rPr>
-              <w:t>Filter: source=crowdstrike_falcon but NOT servicenow. Show ~190 assets. SAY: 'These are devices your EDR sees that are NOT in ServiceNow. Your CMDB is missing these records.'</w:t>
+              <w:t>Show ~190 assets. SAY: 'These devices your EDR sees are NOT in ServiceNow — your CMDB is missing them.'</w:t>
             </w:r>
           </w:p>
         </w:tc>
@@ -16465,7 +16417,7 @@
                 <w:color w:val="000000"/>
                 <w:sz w:val="18"/>
               </w:rPr>
-              <w:t>Export gap list</w:t>
+              <w:t>Export the list</w:t>
             </w:r>
           </w:p>
         </w:tc>
@@ -16488,7 +16440,7 @@
                 <w:color w:val="000000"/>
                 <w:sz w:val="16"/>
               </w:rPr>
-              <w:t>Export the 190 missing assets. SAY: 'This becomes your CMDB remediation work order. UAI found in 5 minutes what would take weeks to discover manually.'</w:t>
+              <w:t>SAY: 'This becomes your CMDB remediation work order. UAI found in 5 minutes what a manual audit takes weeks to produce.'</w:t>
             </w:r>
           </w:p>
         </w:tc>
@@ -16510,11 +16462,11 @@
         <w:tc>
           <w:tcPr>
             <w:tcW w:type="dxa" w:w="3264"/>
-            <w:shd w:val="clear" w:color="auto" w:fill="FDECEA"/>
-          </w:tcPr>
-          <w:p>
-            <w:pPr>
-              <w:jc w:val="left"/>
+            <w:shd w:val="clear" w:color="auto" w:fill="FFFFFF"/>
+          </w:tcPr>
+          <w:p>
+            <w:pPr>
+              <w:jc w:val="center"/>
               <w:spacing w:before="0" w:after="0"/>
             </w:pPr>
             <w:r/>
@@ -16523,26 +16475,160 @@
                 <w:rFonts w:ascii="Calibri" w:hAnsi="Calibri"/>
                 <w:b/>
                 <w:i w:val="0"/>
-                <w:color w:val="C62828"/>
-                <w:sz w:val="18"/>
-              </w:rPr>
-              <w:t>⛔  DO NOT ATTEMPT TODAY — Fields that will show blank</w:t>
-            </w:r>
-          </w:p>
-        </w:tc>
+                <w:color w:val="000000"/>
+                <w:sz w:val="18"/>
+              </w:rPr>
+              <w:t>Open one asset</w:t>
+            </w:r>
+          </w:p>
+        </w:tc>
+        <w:tc>
+          <w:tcPr>
+            <w:tcW w:type="dxa" w:w="3264"/>
+            <w:shd w:val="clear" w:color="auto" w:fill="FFFFFF"/>
+          </w:tcPr>
+          <w:p>
+            <w:pPr>
+              <w:jc w:val="left"/>
+              <w:spacing w:before="0" w:after="0"/>
+            </w:pPr>
+            <w:r/>
+            <w:r>
+              <w:rPr>
+                <w:rFonts w:ascii="Calibri" w:hAnsi="Calibri"/>
+                <w:b w:val="0"/>
+                <w:i w:val="0"/>
+                <w:color w:val="000000"/>
+                <w:sz w:val="16"/>
+              </w:rPr>
+              <w:t>Show CrowdStrike + Intune badges but NO ServiceNow badge. 'One device, two sources — but your CMDB is blind to it.'</w:t>
+            </w:r>
+          </w:p>
+        </w:tc>
+        <w:tc>
+          <w:tcPr>
+            <w:tcW w:type="dxa" w:w="3264"/>
+            <w:shd w:val="clear" w:color="auto" w:fill="FFFFFF"/>
+          </w:tcPr>
+          <w:p>
+            <w:pPr>
+              <w:jc w:val="left"/>
+              <w:spacing w:before="0" w:after="0"/>
+            </w:pPr>
+            <w:r/>
+          </w:p>
+        </w:tc>
+      </w:tr>
+      <w:tr>
         <w:tc>
           <w:tcPr>
             <w:tcW w:type="dxa" w:w="3264"/>
             <w:shd w:val="clear" w:color="auto" w:fill="FDECEA"/>
           </w:tcPr>
-          <w:p/>
+          <w:p>
+            <w:pPr>
+              <w:jc w:val="left"/>
+              <w:spacing w:before="0" w:after="0"/>
+            </w:pPr>
+            <w:r/>
+            <w:r>
+              <w:rPr>
+                <w:rFonts w:ascii="Calibri" w:hAnsi="Calibri"/>
+                <w:b/>
+                <w:i w:val="0"/>
+                <w:color w:val="C62828"/>
+                <w:sz w:val="18"/>
+              </w:rPr>
+              <w:t>⛔  DO NOT ATTEMPT TODAY</w:t>
+            </w:r>
+          </w:p>
         </w:tc>
         <w:tc>
           <w:tcPr>
             <w:tcW w:type="dxa" w:w="3264"/>
             <w:shd w:val="clear" w:color="auto" w:fill="FDECEA"/>
           </w:tcPr>
-          <w:p/>
+          <w:p>
+            <w:pPr>
+              <w:jc w:val="left"/>
+              <w:spacing w:before="0" w:after="0"/>
+            </w:pPr>
+            <w:r/>
+          </w:p>
+        </w:tc>
+        <w:tc>
+          <w:tcPr>
+            <w:tcW w:type="dxa" w:w="3264"/>
+            <w:shd w:val="clear" w:color="auto" w:fill="FDECEA"/>
+          </w:tcPr>
+          <w:p>
+            <w:pPr>
+              <w:jc w:val="left"/>
+              <w:spacing w:before="0" w:after="0"/>
+            </w:pPr>
+            <w:r/>
+          </w:p>
+        </w:tc>
+      </w:tr>
+      <w:tr>
+        <w:tc>
+          <w:tcPr>
+            <w:tcW w:type="dxa" w:w="3264"/>
+            <w:shd w:val="clear" w:color="auto" w:fill="FFFFFF"/>
+          </w:tcPr>
+          <w:p>
+            <w:pPr>
+              <w:jc w:val="center"/>
+              <w:spacing w:before="0" w:after="0"/>
+            </w:pPr>
+            <w:r/>
+            <w:r>
+              <w:rPr>
+                <w:rFonts w:ascii="Calibri" w:hAnsi="Calibri"/>
+                <w:b/>
+                <w:i w:val="0"/>
+                <w:color w:val="000000"/>
+                <w:sz w:val="18"/>
+              </w:rPr>
+              <w:t>Location / Region</w:t>
+            </w:r>
+          </w:p>
+        </w:tc>
+        <w:tc>
+          <w:tcPr>
+            <w:tcW w:type="dxa" w:w="3264"/>
+            <w:shd w:val="clear" w:color="auto" w:fill="FFFFFF"/>
+          </w:tcPr>
+          <w:p>
+            <w:pPr>
+              <w:jc w:val="left"/>
+              <w:spacing w:before="0" w:after="0"/>
+            </w:pPr>
+            <w:r/>
+            <w:r>
+              <w:rPr>
+                <w:rFonts w:ascii="Calibri" w:hAnsi="Calibri"/>
+                <w:b w:val="0"/>
+                <w:i w:val="0"/>
+                <w:color w:val="000000"/>
+                <w:sz w:val="16"/>
+              </w:rPr>
+              <w:t>Will appear empty — BUG-002: mock returns reference objects not strings (fix: sysparm_display_value=true in mock)</w:t>
+            </w:r>
+          </w:p>
+        </w:tc>
+        <w:tc>
+          <w:tcPr>
+            <w:tcW w:type="dxa" w:w="3264"/>
+            <w:shd w:val="clear" w:color="auto" w:fill="FFFFFF"/>
+          </w:tcPr>
+          <w:p>
+            <w:pPr>
+              <w:jc w:val="left"/>
+              <w:spacing w:before="0" w:after="0"/>
+            </w:pPr>
+            <w:r/>
+          </w:p>
         </w:tc>
       </w:tr>
       <w:tr>
@@ -16565,7 +16651,7 @@
                 <w:color w:val="000000"/>
                 <w:sz w:val="18"/>
               </w:rPr>
-              <w:t>Location / Region</w:t>
+              <w:t>Manufacturer / Model</w:t>
             </w:r>
           </w:p>
         </w:tc>
@@ -16588,7 +16674,7 @@
                 <w:color w:val="000000"/>
                 <w:sz w:val="16"/>
               </w:rPr>
-              <w:t>Will appear empty — BUG-002: mock returns reference objects, UAI shows null (fix: implement sysparm_display_value=true in mock)</w:t>
+              <w:t>Will appear empty — same root cause as Location (BUG-002)</w:t>
             </w:r>
           </w:p>
         </w:tc>
@@ -16626,7 +16712,7 @@
                 <w:color w:val="000000"/>
                 <w:sz w:val="18"/>
               </w:rPr>
-              <w:t>Manufacturer / Model</w:t>
+              <w:t>FQDN for laptop assets</w:t>
             </w:r>
           </w:p>
         </w:tc>
@@ -16649,7 +16735,7 @@
                 <w:color w:val="000000"/>
                 <w:sz w:val="16"/>
               </w:rPr>
-              <w:t>Will appear empty — same root cause as Location (BUG-002)</w:t>
+              <w:t>Empty for cmdb_ci_computer — BUG-001: fqdn not in sysparm_fields</w:t>
             </w:r>
           </w:p>
         </w:tc>
@@ -16687,7 +16773,7 @@
                 <w:color w:val="000000"/>
                 <w:sz w:val="18"/>
               </w:rPr>
-              <w:t>FQDN for laptop assets</w:t>
+              <w:t>Owner / Assigned To filter</w:t>
             </w:r>
           </w:p>
         </w:tc>
@@ -16710,7 +16796,7 @@
                 <w:color w:val="000000"/>
                 <w:sz w:val="16"/>
               </w:rPr>
-              <w:t>Will appear empty for cmdb_ci_computer assets — BUG-001: not in sysparm_fields</w:t>
+              <w:t>Cannot filter by this — BUG-003: only in raw_provider_data</w:t>
             </w:r>
           </w:p>
         </w:tc>
@@ -16732,7 +16818,58 @@
         <w:tc>
           <w:tcPr>
             <w:tcW w:type="dxa" w:w="3264"/>
-            <w:shd w:val="clear" w:color="auto" w:fill="FFFFFF"/>
+            <w:shd w:val="clear" w:color="auto" w:fill="E0F2F1"/>
+          </w:tcPr>
+          <w:p>
+            <w:pPr>
+              <w:jc w:val="left"/>
+              <w:spacing w:before="0" w:after="0"/>
+            </w:pPr>
+            <w:r/>
+            <w:r>
+              <w:rPr>
+                <w:rFonts w:ascii="Calibri" w:hAnsi="Calibri"/>
+                <w:b/>
+                <w:i w:val="0"/>
+                <w:color w:val="006064"/>
+                <w:sz w:val="18"/>
+              </w:rPr>
+              <w:t>FUTURE DEMO ANGLES (post-fix)</w:t>
+            </w:r>
+          </w:p>
+        </w:tc>
+        <w:tc>
+          <w:tcPr>
+            <w:tcW w:type="dxa" w:w="3264"/>
+            <w:shd w:val="clear" w:color="auto" w:fill="E0F2F1"/>
+          </w:tcPr>
+          <w:p>
+            <w:pPr>
+              <w:jc w:val="left"/>
+              <w:spacing w:before="0" w:after="0"/>
+            </w:pPr>
+            <w:r/>
+          </w:p>
+        </w:tc>
+        <w:tc>
+          <w:tcPr>
+            <w:tcW w:type="dxa" w:w="3264"/>
+            <w:shd w:val="clear" w:color="auto" w:fill="E0F2F1"/>
+          </w:tcPr>
+          <w:p>
+            <w:pPr>
+              <w:jc w:val="left"/>
+              <w:spacing w:before="0" w:after="0"/>
+            </w:pPr>
+            <w:r/>
+          </w:p>
+        </w:tc>
+      </w:tr>
+      <w:tr>
+        <w:tc>
+          <w:tcPr>
+            <w:tcW w:type="dxa" w:w="3264"/>
+            <w:shd w:val="clear" w:color="auto" w:fill="EEF3F8"/>
           </w:tcPr>
           <w:p>
             <w:pPr>
@@ -16748,10 +16885,48 @@
                 <w:color w:val="000000"/>
                 <w:sz w:val="18"/>
               </w:rPr>
-              <w:t>Owner / Assigned To filter</w:t>
-            </w:r>
-          </w:p>
-        </w:tc>
+              <w:t>Location CMDB reports</w:t>
+            </w:r>
+          </w:p>
+        </w:tc>
+        <w:tc>
+          <w:tcPr>
+            <w:tcW w:type="dxa" w:w="3264"/>
+            <w:shd w:val="clear" w:color="auto" w:fill="EEF3F8"/>
+          </w:tcPr>
+          <w:p>
+            <w:pPr>
+              <w:jc w:val="left"/>
+              <w:spacing w:before="0" w:after="0"/>
+            </w:pPr>
+            <w:r/>
+            <w:r>
+              <w:rPr>
+                <w:rFonts w:ascii="Calibri" w:hAnsi="Calibri"/>
+                <w:b w:val="0"/>
+                <w:i w:val="0"/>
+                <w:color w:val="000000"/>
+                <w:sz w:val="16"/>
+              </w:rPr>
+              <w:t>BUG-002 fixed: 'Show all assets in Bangalore that ServiceNow shows Installed but CrowdStrike hasn't seen in 7 days'</w:t>
+            </w:r>
+          </w:p>
+        </w:tc>
+        <w:tc>
+          <w:tcPr>
+            <w:tcW w:type="dxa" w:w="3264"/>
+            <w:shd w:val="clear" w:color="auto" w:fill="EEF3F8"/>
+          </w:tcPr>
+          <w:p>
+            <w:pPr>
+              <w:jc w:val="left"/>
+              <w:spacing w:before="0" w:after="0"/>
+            </w:pPr>
+            <w:r/>
+          </w:p>
+        </w:tc>
+      </w:tr>
+      <w:tr>
         <w:tc>
           <w:tcPr>
             <w:tcW w:type="dxa" w:w="3264"/>
@@ -16759,19 +16934,19 @@
           </w:tcPr>
           <w:p>
             <w:pPr>
-              <w:jc w:val="left"/>
+              <w:jc w:val="center"/>
               <w:spacing w:before="0" w:after="0"/>
             </w:pPr>
             <w:r/>
             <w:r>
               <w:rPr>
                 <w:rFonts w:ascii="Calibri" w:hAnsi="Calibri"/>
-                <w:b w:val="0"/>
-                <w:i w:val="0"/>
-                <w:color w:val="000000"/>
-                <w:sz w:val="16"/>
-              </w:rPr>
-              <w:t>Cannot filter by assigned_to — BUG-003: field in raw_provider_data only, not top-level UAI attribute</w:t>
+                <w:b/>
+                <w:i w:val="0"/>
+                <w:color w:val="000000"/>
+                <w:sz w:val="18"/>
+              </w:rPr>
+              <w:t>User pivot</w:t>
             </w:r>
           </w:p>
         </w:tc>
@@ -16786,160 +16961,22 @@
               <w:spacing w:before="0" w:after="0"/>
             </w:pPr>
             <w:r/>
-          </w:p>
-        </w:tc>
-      </w:tr>
-      <w:tr>
-        <w:tc>
-          <w:tcPr>
-            <w:tcW w:type="dxa" w:w="3264"/>
-            <w:shd w:val="clear" w:color="auto" w:fill="E0F2F1"/>
-          </w:tcPr>
-          <w:p>
-            <w:pPr>
-              <w:jc w:val="left"/>
-              <w:spacing w:before="0" w:after="0"/>
-            </w:pPr>
-            <w:r/>
-            <w:r>
-              <w:rPr>
-                <w:rFonts w:ascii="Calibri" w:hAnsi="Calibri"/>
-                <w:b/>
-                <w:i w:val="0"/>
-                <w:color w:val="006064"/>
-                <w:sz w:val="18"/>
-              </w:rPr>
-              <w:t>FUTURE DEMO ANGLES (post-fix)</w:t>
-            </w:r>
-          </w:p>
-        </w:tc>
-        <w:tc>
-          <w:tcPr>
-            <w:tcW w:type="dxa" w:w="3264"/>
-            <w:shd w:val="clear" w:color="auto" w:fill="E0F2F1"/>
-          </w:tcPr>
-          <w:p/>
-        </w:tc>
-        <w:tc>
-          <w:tcPr>
-            <w:tcW w:type="dxa" w:w="3264"/>
-            <w:shd w:val="clear" w:color="auto" w:fill="E0F2F1"/>
-          </w:tcPr>
-          <w:p/>
-        </w:tc>
-      </w:tr>
-      <w:tr>
+            <w:r>
+              <w:rPr>
+                <w:rFonts w:ascii="Calibri" w:hAnsi="Calibri"/>
+                <w:b w:val="0"/>
+                <w:i w:val="0"/>
+                <w:color w:val="000000"/>
+                <w:sz w:val="16"/>
+              </w:rPr>
+              <w:t>BUG-003 fixed: 'Click asset → see assigned owner from ServiceNow → all assets owned by that user'</w:t>
+            </w:r>
+          </w:p>
+        </w:tc>
         <w:tc>
           <w:tcPr>
             <w:tcW w:type="dxa" w:w="3264"/>
             <w:shd w:val="clear" w:color="auto" w:fill="FFFFFF"/>
-          </w:tcPr>
-          <w:p>
-            <w:pPr>
-              <w:jc w:val="center"/>
-              <w:spacing w:before="0" w:after="0"/>
-            </w:pPr>
-            <w:r/>
-            <w:r>
-              <w:rPr>
-                <w:rFonts w:ascii="Calibri" w:hAnsi="Calibri"/>
-                <w:b/>
-                <w:i w:val="0"/>
-                <w:color w:val="000000"/>
-                <w:sz w:val="18"/>
-              </w:rPr>
-              <w:t>Location-based CMDB reports</w:t>
-            </w:r>
-          </w:p>
-        </w:tc>
-        <w:tc>
-          <w:tcPr>
-            <w:tcW w:type="dxa" w:w="3264"/>
-            <w:shd w:val="clear" w:color="auto" w:fill="FFFFFF"/>
-          </w:tcPr>
-          <w:p>
-            <w:pPr>
-              <w:jc w:val="left"/>
-              <w:spacing w:before="0" w:after="0"/>
-            </w:pPr>
-            <w:r/>
-            <w:r>
-              <w:rPr>
-                <w:rFonts w:ascii="Calibri" w:hAnsi="Calibri"/>
-                <w:b w:val="0"/>
-                <w:i w:val="0"/>
-                <w:color w:val="000000"/>
-                <w:sz w:val="16"/>
-              </w:rPr>
-              <w:t>With BUG-002 fixed: 'Show all assets in Bangalore that ServiceNow CMDB shows as Installed but CrowdStrike hasn't seen in 7 days'</w:t>
-            </w:r>
-          </w:p>
-        </w:tc>
-        <w:tc>
-          <w:tcPr>
-            <w:tcW w:type="dxa" w:w="3264"/>
-            <w:shd w:val="clear" w:color="auto" w:fill="FFFFFF"/>
-          </w:tcPr>
-          <w:p>
-            <w:pPr>
-              <w:jc w:val="left"/>
-              <w:spacing w:before="0" w:after="0"/>
-            </w:pPr>
-            <w:r/>
-          </w:p>
-        </w:tc>
-      </w:tr>
-      <w:tr>
-        <w:tc>
-          <w:tcPr>
-            <w:tcW w:type="dxa" w:w="3264"/>
-            <w:shd w:val="clear" w:color="auto" w:fill="EEF3F8"/>
-          </w:tcPr>
-          <w:p>
-            <w:pPr>
-              <w:jc w:val="center"/>
-              <w:spacing w:before="0" w:after="0"/>
-            </w:pPr>
-            <w:r/>
-            <w:r>
-              <w:rPr>
-                <w:rFonts w:ascii="Calibri" w:hAnsi="Calibri"/>
-                <w:b/>
-                <w:i w:val="0"/>
-                <w:color w:val="000000"/>
-                <w:sz w:val="18"/>
-              </w:rPr>
-              <w:t>User-attribution pivot</w:t>
-            </w:r>
-          </w:p>
-        </w:tc>
-        <w:tc>
-          <w:tcPr>
-            <w:tcW w:type="dxa" w:w="3264"/>
-            <w:shd w:val="clear" w:color="auto" w:fill="EEF3F8"/>
-          </w:tcPr>
-          <w:p>
-            <w:pPr>
-              <w:jc w:val="left"/>
-              <w:spacing w:before="0" w:after="0"/>
-            </w:pPr>
-            <w:r/>
-            <w:r>
-              <w:rPr>
-                <w:rFonts w:ascii="Calibri" w:hAnsi="Calibri"/>
-                <w:b w:val="0"/>
-                <w:i w:val="0"/>
-                <w:color w:val="000000"/>
-                <w:sz w:val="16"/>
-              </w:rPr>
-              <w:t>With BUG-003 fixed: 'Click any asset → see the assigned owner from ServiceNow → pivot to all assets owned by that user'</w:t>
-            </w:r>
-          </w:p>
-        </w:tc>
-        <w:tc>
-          <w:tcPr>
-            <w:tcW w:type="dxa" w:w="3264"/>
-            <w:shd w:val="clear" w:color="auto" w:fill="EEF3F8"/>
           </w:tcPr>
           <w:p>
             <w:pPr>
@@ -16982,7 +17019,7 @@
                 <w:color w:val="FFFFFF"/>
                 <w:sz w:val="20"/>
               </w:rPr>
-              <w:t>7.3  DISCOVERY QUESTIONS  &amp;  OBJECTION HANDLING — ServiceNow</w:t>
+              <w:t>7.3  DISCOVERY QUESTIONS &amp; OBJECTION HANDLING — ServiceNow</w:t>
             </w:r>
           </w:p>
         </w:tc>
@@ -17107,7 +17144,7 @@
                 <w:color w:val="000000"/>
                 <w:sz w:val="16"/>
               </w:rPr>
-              <w:t>How confident are you that your ServiceNow CMDB is accurate? When did you last audit it against your network?</w:t>
+              <w:t>How confident are you that your ServiceNow CMDB is accurate? When did you last audit it against the network?</w:t>
             </w:r>
           </w:p>
         </w:tc>
@@ -17130,7 +17167,7 @@
                 <w:color w:val="000000"/>
                 <w:sz w:val="16"/>
               </w:rPr>
-              <w:t>Surfaces the CMDB gap pain — leads directly to UC-7A demo</w:t>
+              <w:t>Surfaces CMDB gap pain → UC-7A demo</w:t>
             </w:r>
           </w:p>
         </w:tc>
@@ -17178,7 +17215,7 @@
                 <w:color w:val="000000"/>
                 <w:sz w:val="16"/>
               </w:rPr>
-              <w:t>When a security alert fires on an IP address, how many tools do you open to find the CMDB record and the assigned owner?</w:t>
+              <w:t>When a security alert fires on an IP, how many tools do you open to find the CMDB record and assigned owner?</w:t>
             </w:r>
           </w:p>
         </w:tc>
@@ -17201,7 +17238,7 @@
                 <w:color w:val="000000"/>
                 <w:sz w:val="16"/>
               </w:rPr>
-              <w:t>Surfaces the multi-tool pivot pain — leads to UC-7C (incident response context)</w:t>
+              <w:t>Surfaces multi-tool pivot pain → UC-7C</w:t>
             </w:r>
           </w:p>
         </w:tc>
@@ -17226,7 +17263,7 @@
                 <w:color w:val="000000"/>
                 <w:sz w:val="16"/>
               </w:rPr>
-              <w:t>Q3  ·  Cross-Tool Correlation</w:t>
+              <w:t>Q3  ·  Cross-Tool Silos</w:t>
             </w:r>
           </w:p>
         </w:tc>
@@ -17249,7 +17286,7 @@
                 <w:color w:val="000000"/>
                 <w:sz w:val="16"/>
               </w:rPr>
-              <w:t>Do your CrowdStrike or Intune teams share asset data with the ServiceNow team? How is that done today?</w:t>
+              <w:t>Do your CrowdStrike and ServiceNow teams share asset data? How is that done today?</w:t>
             </w:r>
           </w:p>
         </w:tc>
@@ -17272,7 +17309,7 @@
                 <w:color w:val="000000"/>
                 <w:sz w:val="16"/>
               </w:rPr>
-              <w:t>Surfaces manual correlation pain — leads to UC-7B (multi-source enrichment)</w:t>
+              <w:t>Surfaces manual correlation pain → UC-7B</w:t>
             </w:r>
           </w:p>
         </w:tc>
@@ -17320,7 +17357,7 @@
                 <w:color w:val="000000"/>
                 <w:sz w:val="16"/>
               </w:rPr>
-              <w:t>Of all the devices on your network, what percentage do you believe are represented in ServiceNow right now?</w:t>
+              <w:t>What percentage of devices on your network are in ServiceNow right now?</w:t>
             </w:r>
           </w:p>
         </w:tc>
@@ -17343,7 +17380,7 @@
                 <w:color w:val="000000"/>
                 <w:sz w:val="16"/>
               </w:rPr>
-              <w:t>Quantifies the gap — the answer is almost always 'I don't know' which sets up the gap detection demo</w:t>
+              <w:t>Answer is usually 'I don't know' — sets up gap detection demo</w:t>
             </w:r>
           </w:p>
         </w:tc>
@@ -17368,7 +17405,7 @@
                 <w:color w:val="FFFFFF"/>
                 <w:sz w:val="18"/>
               </w:rPr>
-              <w:t>OBJECTIONS  &amp;  RESPONSES</w:t>
+              <w:t>OBJECTIONS &amp; RESPONSES</w:t>
             </w:r>
           </w:p>
         </w:tc>
@@ -17419,7 +17456,7 @@
                 <w:color w:val="000000"/>
                 <w:sz w:val="16"/>
               </w:rPr>
-              <w:t>OBJECTION: 'Our CMDB is already accurate — we have a dedicated team maintaining it'</w:t>
+              <w:t>OBJECTION: 'Our CMDB team keeps it accurate'</w:t>
             </w:r>
           </w:p>
         </w:tc>
@@ -17442,7 +17479,7 @@
                 <w:color w:val="000000"/>
                 <w:sz w:val="16"/>
               </w:rPr>
-              <w:t>That's exactly the team that benefits most from UAI. We show you which assets the network sees that your team hasn't catalogued yet — a living audit that runs continuously, not quarterly.</w:t>
+              <w:t>That's exactly who benefits most from UAI — we show which assets the network sees that the team hasn't catalogued yet. It's a continuous living audit, not a quarterly project.</w:t>
             </w:r>
           </w:p>
         </w:tc>
@@ -17465,7 +17502,7 @@
                 <w:color w:val="000000"/>
                 <w:sz w:val="16"/>
               </w:rPr>
-              <w:t>Reframe from replacement to augmentation</w:t>
+              <w:t>Reframe: augmentation not replacement</w:t>
             </w:r>
           </w:p>
         </w:tc>
@@ -17490,7 +17527,7 @@
                 <w:color w:val="000000"/>
                 <w:sz w:val="16"/>
               </w:rPr>
-              <w:t>OBJECTION: 'We already have ServiceNow Discovery — it does this automatically'</w:t>
+              <w:t>OBJECTION: 'We have ServiceNow Discovery already'</w:t>
             </w:r>
           </w:p>
         </w:tc>
@@ -17513,7 +17550,7 @@
                 <w:color w:val="000000"/>
                 <w:sz w:val="16"/>
               </w:rPr>
-              <w:t>ServiceNow Discovery is scan-based — it finds assets present at scan time. UAI uses agent and DHCP/DNS data to catch ephemeral assets (remote workers, guest devices, IoT) that scan-based discovery misses.</w:t>
+              <w:t>ServiceNow Discovery is scan-based — it misses ephemeral assets (remote workers, guest devices, IoT). UAI uses agent + DHCP/DNS data for continuous, multi-source coverage.</w:t>
             </w:r>
           </w:p>
         </w:tc>
@@ -17536,7 +17573,7 @@
                 <w:color w:val="000000"/>
                 <w:sz w:val="16"/>
               </w:rPr>
-              <w:t>Differentiate UAI's continuous, multi-source approach</w:t>
+              <w:t>Differentiate UAI's continuous approach</w:t>
             </w:r>
           </w:p>
         </w:tc>
@@ -17561,7 +17598,7 @@
                 <w:color w:val="000000"/>
                 <w:sz w:val="16"/>
               </w:rPr>
-              <w:t>OBJECTION: 'Why is Location/Model blank for some assets in your demo?'</w:t>
+              <w:t>OBJECTION: 'Location and Model show blank in your demo'</w:t>
             </w:r>
           </w:p>
         </w:tc>
@@ -17584,7 +17621,7 @@
                 <w:color w:val="000000"/>
                 <w:sz w:val="16"/>
               </w:rPr>
-              <w:t>Good catch — that's a known mock configuration issue where reference field display values aren't flattened. In production UAI connected to a real ServiceNow instance, location and model populate correctly because the real API returns plain strings with display_value=true.</w:t>
+              <w:t>Good catch — that's a mock configuration issue where reference field display values aren't flattened. In production with a real ServiceNow instance, location and model populate correctly.</w:t>
             </w:r>
           </w:p>
         </w:tc>
@@ -17607,7 +17644,7 @@
                 <w:color w:val="000000"/>
                 <w:sz w:val="16"/>
               </w:rPr>
-              <w:t>Honest transparency — BUG-002 is mock-specific, not a production UAI limitation</w:t>
+              <w:t>Honest: BUG-002 is mock-specific, not a UAI production limitation</w:t>
             </w:r>
           </w:p>
         </w:tc>
@@ -17655,7 +17692,7 @@
                 <w:color w:val="000000"/>
                 <w:sz w:val="16"/>
               </w:rPr>
-              <w:t>UAI is not a CMDB. It's a cross-source correlation layer that sits on top of your existing tools. ServiceNow keeps being your CMDB. UAI just shows you what your CMDB is missing and enriches it with live network data.</w:t>
+              <w:t>UAI is not a CMDB. It's a cross-source correlation layer. ServiceNow stays your CMDB. UAI just shows what it's missing and enriches it with live network data.</w:t>
             </w:r>
           </w:p>
         </w:tc>
@@ -17678,7 +17715,7 @@
                 <w:color w:val="000000"/>
                 <w:sz w:val="16"/>
               </w:rPr>
-              <w:t>Positioning: UAI complements, not replaces, ServiceNow</w:t>
+              <w:t>Positioning: UAI complements ServiceNow</w:t>
             </w:r>
           </w:p>
         </w:tc>
@@ -17899,7 +17936,7 @@
               </w:rPr>
               <w:t>CMDB gap detection (UC-7A)</w:t>
               <w:br/>
-              <w:t>Cross-source enrichment (UC-7B)</w:t>
+              <w:t>Enrichment (UC-7B)</w:t>
             </w:r>
           </w:p>
         </w:tc>
@@ -17922,7 +17959,7 @@
                 <w:color w:val="000000"/>
                 <w:sz w:val="16"/>
               </w:rPr>
-              <w:t>Active ServiceNow CMDB with dedicated ITAM team; known CMDB hygiene backlog</w:t>
+              <w:t>Active ServiceNow CMDB; known CMDB hygiene backlog</w:t>
             </w:r>
           </w:p>
         </w:tc>
@@ -17945,7 +17982,7 @@
                 <w:color w:val="000000"/>
                 <w:sz w:val="16"/>
               </w:rPr>
-              <w:t>No ServiceNow (or purely manual CMDB process)</w:t>
+              <w:t>No ServiceNow at all</w:t>
             </w:r>
           </w:p>
         </w:tc>
@@ -17970,7 +18007,7 @@
                 <w:color w:val="000000"/>
                 <w:sz w:val="16"/>
               </w:rPr>
-              <w:t>Security Ops / IR Team</w:t>
+              <w:t>Security Ops / IR</w:t>
             </w:r>
           </w:p>
         </w:tc>
@@ -17993,7 +18030,7 @@
                 <w:color w:val="000000"/>
                 <w:sz w:val="16"/>
               </w:rPr>
-              <w:t>Incident context pivot (UC-7C)</w:t>
+              <w:t>Incident context (UC-7C)</w:t>
               <w:br/>
               <w:t>Cross-source correlation</w:t>
             </w:r>
@@ -18018,7 +18055,7 @@
                 <w:color w:val="000000"/>
                 <w:sz w:val="16"/>
               </w:rPr>
-              <w:t>Uses both ServiceNow and CrowdStrike; SOC struggles to cross-reference during incidents</w:t>
+              <w:t>Uses ServiceNow + CrowdStrike; SOC pivots slowly between tools</w:t>
             </w:r>
           </w:p>
         </w:tc>
@@ -18041,7 +18078,7 @@
                 <w:color w:val="000000"/>
                 <w:sz w:val="16"/>
               </w:rPr>
-              <w:t>No EDR; ServiceNow is the only asset source</w:t>
+              <w:t>No EDR; ServiceNow is only source</w:t>
             </w:r>
           </w:p>
         </w:tc>
@@ -18066,7 +18103,7 @@
                 <w:color w:val="000000"/>
                 <w:sz w:val="16"/>
               </w:rPr>
-              <w:t>IT Operations / Infrastructure</w:t>
+              <w:t>IT Operations</w:t>
             </w:r>
           </w:p>
         </w:tc>
@@ -18091,7 +18128,7 @@
               </w:rPr>
               <w:t>Continuous CMDB auditing</w:t>
               <w:br/>
-              <w:t>Hardware refresh planning by location</w:t>
+              <w:t>Hardware refresh planning</w:t>
             </w:r>
           </w:p>
         </w:tc>
@@ -18114,7 +18151,7 @@
                 <w:color w:val="000000"/>
                 <w:sz w:val="16"/>
               </w:rPr>
-              <w:t>Large distributed fleet (multiple sites) with complex ServiceNow taxonomy</w:t>
+              <w:t>Large distributed fleet with complex ServiceNow CI taxonomy</w:t>
             </w:r>
           </w:p>
         </w:tc>
@@ -18137,7 +18174,7 @@
                 <w:color w:val="000000"/>
                 <w:sz w:val="16"/>
               </w:rPr>
-              <w:t>Small fleet where ServiceNow CMDB is manually maintained and accurate</w:t>
+              <w:t>Small fleet; CMDB manually kept accurate</w:t>
             </w:r>
           </w:p>
         </w:tc>
@@ -18226,7 +18263,7 @@
                 <w:color w:val="1B5E20"/>
                 <w:sz w:val="16"/>
               </w:rPr>
-              <w:t>ServiceNow CMDB has known accuracy gaps or was last audited &gt; 6 months ago</w:t>
+              <w:t>ServiceNow CMDB has known gaps or was last audited &gt; 6 months ago</w:t>
             </w:r>
           </w:p>
         </w:tc>
@@ -18290,7 +18327,7 @@
                 <w:color w:val="1B5E20"/>
                 <w:sz w:val="16"/>
               </w:rPr>
-              <w:t>Team uses both ServiceNow and CrowdStrike Falcon / Intune in parallel (siloed data)</w:t>
+              <w:t>Team uses ServiceNow + CrowdStrike/Intune in parallel with no automatic sync</w:t>
             </w:r>
           </w:p>
         </w:tc>
@@ -18354,7 +18391,7 @@
                 <w:color w:val="1B5E20"/>
                 <w:sz w:val="16"/>
               </w:rPr>
-              <w:t>Security team needs to pivot from alert → CMDB record in &lt; 60 seconds</w:t>
+              <w:t>SOC needs IP → CMDB record pivot in &lt; 60 seconds</w:t>
             </w:r>
           </w:p>
         </w:tc>
@@ -18546,7 +18583,7 @@
                 <w:color w:val="C62828"/>
                 <w:sz w:val="16"/>
               </w:rPr>
-              <w:t>ServiceNow CMDB is the ONLY asset source (no EDR, no MDM, no network visibility tool)</w:t>
+              <w:t>ServiceNow is the ONLY asset source — no EDR, no MDM, no network visibility tool</w:t>
             </w:r>
           </w:p>
         </w:tc>
@@ -18610,7 +18647,7 @@
                 <w:color w:val="C62828"/>
                 <w:sz w:val="16"/>
               </w:rPr>
-              <w:t>Organization has &lt; 200 endpoints — CMDB gap is manageable manually</w:t>
+              <w:t>Organization &lt; 200 endpoints — CMDB gap is manageable manually</w:t>
             </w:r>
           </w:p>
         </w:tc>
@@ -18738,7 +18775,7 @@
                 <w:color w:val="000000"/>
                 <w:sz w:val="16"/>
               </w:rPr>
-              <w:t>'UAI doesn't replace ServiceNow — it continuously audits it. Every 190 assets we found missing today is 190 potential security blind spots. Let's set up a pilot with your real ServiceNow tenant and see the actual gap in your environment.'</w:t>
+              <w:t>'UAI doesn't replace ServiceNow — it continuously audits it. The 190 assets we found missing today are 190 potential security blind spots. Let's run a pilot with your real ServiceNow tenant and see the actual gap in your environment.'</w:t>
             </w:r>
           </w:p>
         </w:tc>

</xml_diff>

<commit_message>
Playbook: mark Intune Section A (UC-1–5) as NOT AVAILABLE TODAY
Section A header changed from green to red with text 'NOT AVAILABLE TODAY'.
UC-1 through UC-5 rows tinted light red to match. Section B (post-fix use cases)
unchanged.

Co-Authored-By: Claude Sonnet 4.6 <noreply@anthropic.com>
</commit_message>
<xml_diff>
--- a/fixes/UAI_Integrations_Playbook.docx
+++ b/fixes/UAI_Integrations_Playbook.docx
@@ -821,16 +821,22 @@
           <w:tcPr>
             <w:tcW w:w="9792" w:type="dxa"/>
             <w:gridSpan w:val="2"/>
-            <w:shd w:val="clear" w:color="auto" w:fill="1B5E20"/>
-          </w:tcPr>
-          <w:p>
-            <w:r>
-              <w:rPr>
+            <w:shd w:val="clear" w:color="auto" w:fill="C62828"/>
+          </w:tcPr>
+          <w:p>
+            <w:pPr>
+              <w:jc w:val="left"/>
+              <w:spacing w:before="0" w:after="0"/>
+            </w:pPr>
+            <w:r/>
+            <w:r>
+              <w:rPr>
+                <w:rFonts w:ascii="Calibri" w:hAnsi="Calibri"/>
                 <w:b/>
                 <w:color w:val="FFFFFF"/>
-                <w:sz w:val="20"/>
-              </w:rPr>
-              <w:t>SECTION A  —  AVAILABLE TODAY</w:t>
+                <w:sz w:val="18"/>
+              </w:rPr>
+              <w:t>SECTION A  —  NOT AVAILABLE TODAY</w:t>
             </w:r>
           </w:p>
         </w:tc>
@@ -839,13 +845,13 @@
         <w:tc>
           <w:tcPr>
             <w:tcW w:w="4896" w:type="dxa"/>
-            <w:shd w:val="clear" w:color="auto" w:fill="1B5E20"/>
-          </w:tcPr>
-          <w:p>
-            <w:r>
-              <w:rPr>
-                <w:b/>
-                <w:color w:val="FFFFFF"/>
+            <w:shd w:val="clear" w:color="auto" w:fill="FDECEA"/>
+          </w:tcPr>
+          <w:p>
+            <w:r>
+              <w:rPr>
+                <w:b/>
+                <w:color w:val="C62828"/>
                 <w:sz w:val="18"/>
               </w:rPr>
               <w:t>UC-1  ·  MDM Compliance</w:t>
@@ -853,7 +859,7 @@
             <w:r>
               <w:rPr>
                 <w:b/>
-                <w:color w:val="FFFFFF"/>
+                <w:color w:val="C62828"/>
                 <w:sz w:val="18"/>
               </w:rPr>
               <w:br/>
@@ -864,19 +870,19 @@
         <w:tc>
           <w:tcPr>
             <w:tcW w:w="4896" w:type="dxa"/>
-            <w:shd w:val="clear" w:color="auto" w:fill="E8F5E9"/>
-          </w:tcPr>
-          <w:p>
-            <w:r>
-              <w:rPr>
-                <w:color w:val="000000"/>
+            <w:shd w:val="clear" w:color="auto" w:fill="FDECEA"/>
+          </w:tcPr>
+          <w:p>
+            <w:r>
+              <w:rPr>
+                <w:color w:val="C62828"/>
                 <w:sz w:val="18"/>
               </w:rPr>
               <w:t>PROBLEM: Security teams can't quickly answer how many devices are out of policy, what type, or which site.</w:t>
             </w:r>
             <w:r>
               <w:rPr>
-                <w:color w:val="000000"/>
+                <w:color w:val="C62828"/>
                 <w:sz w:val="18"/>
               </w:rPr>
               <w:br/>
@@ -884,7 +890,7 @@
             </w:r>
             <w:r>
               <w:rPr>
-                <w:color w:val="000000"/>
+                <w:color w:val="C62828"/>
                 <w:sz w:val="18"/>
               </w:rPr>
               <w:br/>
@@ -897,13 +903,13 @@
         <w:tc>
           <w:tcPr>
             <w:tcW w:w="4896" w:type="dxa"/>
-            <w:shd w:val="clear" w:color="auto" w:fill="1B5E20"/>
-          </w:tcPr>
-          <w:p>
-            <w:r>
-              <w:rPr>
-                <w:b/>
-                <w:color w:val="FFFFFF"/>
+            <w:shd w:val="clear" w:color="auto" w:fill="FDECEA"/>
+          </w:tcPr>
+          <w:p>
+            <w:r>
+              <w:rPr>
+                <w:b/>
+                <w:color w:val="C62828"/>
                 <w:sz w:val="18"/>
               </w:rPr>
               <w:t>UC-2  ·  Grace Period</w:t>
@@ -911,7 +917,7 @@
             <w:r>
               <w:rPr>
                 <w:b/>
-                <w:color w:val="FFFFFF"/>
+                <w:color w:val="C62828"/>
                 <w:sz w:val="18"/>
               </w:rPr>
               <w:br/>
@@ -922,19 +928,19 @@
         <w:tc>
           <w:tcPr>
             <w:tcW w:w="4896" w:type="dxa"/>
-            <w:shd w:val="clear" w:color="auto" w:fill="E8F5E9"/>
-          </w:tcPr>
-          <w:p>
-            <w:r>
-              <w:rPr>
-                <w:color w:val="000000"/>
+            <w:shd w:val="clear" w:color="auto" w:fill="FDECEA"/>
+          </w:tcPr>
+          <w:p>
+            <w:r>
+              <w:rPr>
+                <w:color w:val="C62828"/>
                 <w:sz w:val="18"/>
               </w:rPr>
               <w:t>PROBLEM: IT teams miss grace period expiry — devices silently lose access with no live operational view.</w:t>
             </w:r>
             <w:r>
               <w:rPr>
-                <w:color w:val="000000"/>
+                <w:color w:val="C62828"/>
                 <w:sz w:val="18"/>
               </w:rPr>
               <w:br/>
@@ -942,7 +948,7 @@
             </w:r>
             <w:r>
               <w:rPr>
-                <w:color w:val="000000"/>
+                <w:color w:val="C62828"/>
                 <w:sz w:val="18"/>
               </w:rPr>
               <w:br/>
@@ -955,13 +961,13 @@
         <w:tc>
           <w:tcPr>
             <w:tcW w:w="4896" w:type="dxa"/>
-            <w:shd w:val="clear" w:color="auto" w:fill="1B5E20"/>
-          </w:tcPr>
-          <w:p>
-            <w:r>
-              <w:rPr>
-                <w:b/>
-                <w:color w:val="FFFFFF"/>
+            <w:shd w:val="clear" w:color="auto" w:fill="FDECEA"/>
+          </w:tcPr>
+          <w:p>
+            <w:r>
+              <w:rPr>
+                <w:b/>
+                <w:color w:val="C62828"/>
                 <w:sz w:val="18"/>
               </w:rPr>
               <w:t>UC-3  ·  Cross-vendor Correlation</w:t>
@@ -969,7 +975,7 @@
             <w:r>
               <w:rPr>
                 <w:b/>
-                <w:color w:val="FFFFFF"/>
+                <w:color w:val="C62828"/>
                 <w:sz w:val="18"/>
               </w:rPr>
               <w:br/>
@@ -980,19 +986,19 @@
         <w:tc>
           <w:tcPr>
             <w:tcW w:w="4896" w:type="dxa"/>
-            <w:shd w:val="clear" w:color="auto" w:fill="E8F5E9"/>
-          </w:tcPr>
-          <w:p>
-            <w:r>
-              <w:rPr>
-                <w:color w:val="000000"/>
+            <w:shd w:val="clear" w:color="auto" w:fill="FDECEA"/>
+          </w:tcPr>
+          <w:p>
+            <w:r>
+              <w:rPr>
+                <w:color w:val="C62828"/>
                 <w:sz w:val="18"/>
               </w:rPr>
               <w:t>PROBLEM: MDM noncompliance and EDR threat posture tracked in separate consoles — manual cross-reference required.</w:t>
             </w:r>
             <w:r>
               <w:rPr>
-                <w:color w:val="000000"/>
+                <w:color w:val="C62828"/>
                 <w:sz w:val="18"/>
               </w:rPr>
               <w:br/>
@@ -1000,7 +1006,7 @@
             </w:r>
             <w:r>
               <w:rPr>
-                <w:color w:val="000000"/>
+                <w:color w:val="C62828"/>
                 <w:sz w:val="18"/>
               </w:rPr>
               <w:br/>
@@ -1013,13 +1019,13 @@
         <w:tc>
           <w:tcPr>
             <w:tcW w:w="4896" w:type="dxa"/>
-            <w:shd w:val="clear" w:color="auto" w:fill="1B5E20"/>
-          </w:tcPr>
-          <w:p>
-            <w:r>
-              <w:rPr>
-                <w:b/>
-                <w:color w:val="FFFFFF"/>
+            <w:shd w:val="clear" w:color="auto" w:fill="FDECEA"/>
+          </w:tcPr>
+          <w:p>
+            <w:r>
+              <w:rPr>
+                <w:b/>
+                <w:color w:val="C62828"/>
                 <w:sz w:val="18"/>
               </w:rPr>
               <w:t>UC-4  ·  VDI Compliance Risk</w:t>
@@ -1029,19 +1035,19 @@
         <w:tc>
           <w:tcPr>
             <w:tcW w:w="4896" w:type="dxa"/>
-            <w:shd w:val="clear" w:color="auto" w:fill="E8F5E9"/>
-          </w:tcPr>
-          <w:p>
-            <w:r>
-              <w:rPr>
-                <w:color w:val="000000"/>
+            <w:shd w:val="clear" w:color="auto" w:fill="FDECEA"/>
+          </w:tcPr>
+          <w:p>
+            <w:r>
+              <w:rPr>
+                <w:color w:val="C62828"/>
                 <w:sz w:val="18"/>
               </w:rPr>
               <w:t>PROBLEM: VDI noncompliance affects every session user — treated identically to a laptop in most tools.</w:t>
             </w:r>
             <w:r>
               <w:rPr>
-                <w:color w:val="000000"/>
+                <w:color w:val="C62828"/>
                 <w:sz w:val="18"/>
               </w:rPr>
               <w:br/>
@@ -1049,7 +1055,7 @@
             </w:r>
             <w:r>
               <w:rPr>
-                <w:color w:val="000000"/>
+                <w:color w:val="C62828"/>
                 <w:sz w:val="18"/>
               </w:rPr>
               <w:br/>
@@ -1062,13 +1068,13 @@
         <w:tc>
           <w:tcPr>
             <w:tcW w:w="4896" w:type="dxa"/>
-            <w:shd w:val="clear" w:color="auto" w:fill="1B5E20"/>
-          </w:tcPr>
-          <w:p>
-            <w:r>
-              <w:rPr>
-                <w:b/>
-                <w:color w:val="FFFFFF"/>
+            <w:shd w:val="clear" w:color="auto" w:fill="FDECEA"/>
+          </w:tcPr>
+          <w:p>
+            <w:r>
+              <w:rPr>
+                <w:b/>
+                <w:color w:val="C62828"/>
                 <w:sz w:val="18"/>
               </w:rPr>
               <w:t>UC-5  ·  BYOD Risk Segmentation</w:t>
@@ -1078,19 +1084,19 @@
         <w:tc>
           <w:tcPr>
             <w:tcW w:w="4896" w:type="dxa"/>
-            <w:shd w:val="clear" w:color="auto" w:fill="E8F5E9"/>
-          </w:tcPr>
-          <w:p>
-            <w:r>
-              <w:rPr>
-                <w:color w:val="000000"/>
+            <w:shd w:val="clear" w:color="auto" w:fill="FDECEA"/>
+          </w:tcPr>
+          <w:p>
+            <w:r>
+              <w:rPr>
+                <w:color w:val="C62828"/>
                 <w:sz w:val="18"/>
               </w:rPr>
               <w:t>PROBLEM: BYOD devices treated identically to corporate laptops in most compliance reporting.</w:t>
             </w:r>
             <w:r>
               <w:rPr>
-                <w:color w:val="000000"/>
+                <w:color w:val="C62828"/>
                 <w:sz w:val="18"/>
               </w:rPr>
               <w:br/>
@@ -1098,7 +1104,7 @@
             </w:r>
             <w:r>
               <w:rPr>
-                <w:color w:val="000000"/>
+                <w:color w:val="C62828"/>
                 <w:sz w:val="18"/>
               </w:rPr>
               <w:br/>

</xml_diff>

<commit_message>
Revert "Playbook: mark Intune Section A (UC-1–5) as NOT AVAILABLE TODAY"
This reverts commit c9cc5e092a771dc2f7193c53b56e9639ba046d1d.
</commit_message>
<xml_diff>
--- a/fixes/UAI_Integrations_Playbook.docx
+++ b/fixes/UAI_Integrations_Playbook.docx
@@ -821,22 +821,16 @@
           <w:tcPr>
             <w:tcW w:w="9792" w:type="dxa"/>
             <w:gridSpan w:val="2"/>
-            <w:shd w:val="clear" w:color="auto" w:fill="C62828"/>
-          </w:tcPr>
-          <w:p>
-            <w:pPr>
-              <w:jc w:val="left"/>
-              <w:spacing w:before="0" w:after="0"/>
-            </w:pPr>
-            <w:r/>
-            <w:r>
-              <w:rPr>
-                <w:rFonts w:ascii="Calibri" w:hAnsi="Calibri"/>
+            <w:shd w:val="clear" w:color="auto" w:fill="1B5E20"/>
+          </w:tcPr>
+          <w:p>
+            <w:r>
+              <w:rPr>
                 <w:b/>
                 <w:color w:val="FFFFFF"/>
-                <w:sz w:val="18"/>
-              </w:rPr>
-              <w:t>SECTION A  —  NOT AVAILABLE TODAY</w:t>
+                <w:sz w:val="20"/>
+              </w:rPr>
+              <w:t>SECTION A  —  AVAILABLE TODAY</w:t>
             </w:r>
           </w:p>
         </w:tc>
@@ -845,13 +839,13 @@
         <w:tc>
           <w:tcPr>
             <w:tcW w:w="4896" w:type="dxa"/>
-            <w:shd w:val="clear" w:color="auto" w:fill="FDECEA"/>
-          </w:tcPr>
-          <w:p>
-            <w:r>
-              <w:rPr>
-                <w:b/>
-                <w:color w:val="C62828"/>
+            <w:shd w:val="clear" w:color="auto" w:fill="1B5E20"/>
+          </w:tcPr>
+          <w:p>
+            <w:r>
+              <w:rPr>
+                <w:b/>
+                <w:color w:val="FFFFFF"/>
                 <w:sz w:val="18"/>
               </w:rPr>
               <w:t>UC-1  ·  MDM Compliance</w:t>
@@ -859,7 +853,7 @@
             <w:r>
               <w:rPr>
                 <w:b/>
-                <w:color w:val="C62828"/>
+                <w:color w:val="FFFFFF"/>
                 <w:sz w:val="18"/>
               </w:rPr>
               <w:br/>
@@ -870,19 +864,19 @@
         <w:tc>
           <w:tcPr>
             <w:tcW w:w="4896" w:type="dxa"/>
-            <w:shd w:val="clear" w:color="auto" w:fill="FDECEA"/>
-          </w:tcPr>
-          <w:p>
-            <w:r>
-              <w:rPr>
-                <w:color w:val="C62828"/>
+            <w:shd w:val="clear" w:color="auto" w:fill="E8F5E9"/>
+          </w:tcPr>
+          <w:p>
+            <w:r>
+              <w:rPr>
+                <w:color w:val="000000"/>
                 <w:sz w:val="18"/>
               </w:rPr>
               <w:t>PROBLEM: Security teams can't quickly answer how many devices are out of policy, what type, or which site.</w:t>
             </w:r>
             <w:r>
               <w:rPr>
-                <w:color w:val="C62828"/>
+                <w:color w:val="000000"/>
                 <w:sz w:val="18"/>
               </w:rPr>
               <w:br/>
@@ -890,7 +884,7 @@
             </w:r>
             <w:r>
               <w:rPr>
-                <w:color w:val="C62828"/>
+                <w:color w:val="000000"/>
                 <w:sz w:val="18"/>
               </w:rPr>
               <w:br/>
@@ -903,13 +897,13 @@
         <w:tc>
           <w:tcPr>
             <w:tcW w:w="4896" w:type="dxa"/>
-            <w:shd w:val="clear" w:color="auto" w:fill="FDECEA"/>
-          </w:tcPr>
-          <w:p>
-            <w:r>
-              <w:rPr>
-                <w:b/>
-                <w:color w:val="C62828"/>
+            <w:shd w:val="clear" w:color="auto" w:fill="1B5E20"/>
+          </w:tcPr>
+          <w:p>
+            <w:r>
+              <w:rPr>
+                <w:b/>
+                <w:color w:val="FFFFFF"/>
                 <w:sz w:val="18"/>
               </w:rPr>
               <w:t>UC-2  ·  Grace Period</w:t>
@@ -917,7 +911,7 @@
             <w:r>
               <w:rPr>
                 <w:b/>
-                <w:color w:val="C62828"/>
+                <w:color w:val="FFFFFF"/>
                 <w:sz w:val="18"/>
               </w:rPr>
               <w:br/>
@@ -928,19 +922,19 @@
         <w:tc>
           <w:tcPr>
             <w:tcW w:w="4896" w:type="dxa"/>
-            <w:shd w:val="clear" w:color="auto" w:fill="FDECEA"/>
-          </w:tcPr>
-          <w:p>
-            <w:r>
-              <w:rPr>
-                <w:color w:val="C62828"/>
+            <w:shd w:val="clear" w:color="auto" w:fill="E8F5E9"/>
+          </w:tcPr>
+          <w:p>
+            <w:r>
+              <w:rPr>
+                <w:color w:val="000000"/>
                 <w:sz w:val="18"/>
               </w:rPr>
               <w:t>PROBLEM: IT teams miss grace period expiry — devices silently lose access with no live operational view.</w:t>
             </w:r>
             <w:r>
               <w:rPr>
-                <w:color w:val="C62828"/>
+                <w:color w:val="000000"/>
                 <w:sz w:val="18"/>
               </w:rPr>
               <w:br/>
@@ -948,7 +942,7 @@
             </w:r>
             <w:r>
               <w:rPr>
-                <w:color w:val="C62828"/>
+                <w:color w:val="000000"/>
                 <w:sz w:val="18"/>
               </w:rPr>
               <w:br/>
@@ -961,13 +955,13 @@
         <w:tc>
           <w:tcPr>
             <w:tcW w:w="4896" w:type="dxa"/>
-            <w:shd w:val="clear" w:color="auto" w:fill="FDECEA"/>
-          </w:tcPr>
-          <w:p>
-            <w:r>
-              <w:rPr>
-                <w:b/>
-                <w:color w:val="C62828"/>
+            <w:shd w:val="clear" w:color="auto" w:fill="1B5E20"/>
+          </w:tcPr>
+          <w:p>
+            <w:r>
+              <w:rPr>
+                <w:b/>
+                <w:color w:val="FFFFFF"/>
                 <w:sz w:val="18"/>
               </w:rPr>
               <w:t>UC-3  ·  Cross-vendor Correlation</w:t>
@@ -975,7 +969,7 @@
             <w:r>
               <w:rPr>
                 <w:b/>
-                <w:color w:val="C62828"/>
+                <w:color w:val="FFFFFF"/>
                 <w:sz w:val="18"/>
               </w:rPr>
               <w:br/>
@@ -986,19 +980,19 @@
         <w:tc>
           <w:tcPr>
             <w:tcW w:w="4896" w:type="dxa"/>
-            <w:shd w:val="clear" w:color="auto" w:fill="FDECEA"/>
-          </w:tcPr>
-          <w:p>
-            <w:r>
-              <w:rPr>
-                <w:color w:val="C62828"/>
+            <w:shd w:val="clear" w:color="auto" w:fill="E8F5E9"/>
+          </w:tcPr>
+          <w:p>
+            <w:r>
+              <w:rPr>
+                <w:color w:val="000000"/>
                 <w:sz w:val="18"/>
               </w:rPr>
               <w:t>PROBLEM: MDM noncompliance and EDR threat posture tracked in separate consoles — manual cross-reference required.</w:t>
             </w:r>
             <w:r>
               <w:rPr>
-                <w:color w:val="C62828"/>
+                <w:color w:val="000000"/>
                 <w:sz w:val="18"/>
               </w:rPr>
               <w:br/>
@@ -1006,7 +1000,7 @@
             </w:r>
             <w:r>
               <w:rPr>
-                <w:color w:val="C62828"/>
+                <w:color w:val="000000"/>
                 <w:sz w:val="18"/>
               </w:rPr>
               <w:br/>
@@ -1019,13 +1013,13 @@
         <w:tc>
           <w:tcPr>
             <w:tcW w:w="4896" w:type="dxa"/>
-            <w:shd w:val="clear" w:color="auto" w:fill="FDECEA"/>
-          </w:tcPr>
-          <w:p>
-            <w:r>
-              <w:rPr>
-                <w:b/>
-                <w:color w:val="C62828"/>
+            <w:shd w:val="clear" w:color="auto" w:fill="1B5E20"/>
+          </w:tcPr>
+          <w:p>
+            <w:r>
+              <w:rPr>
+                <w:b/>
+                <w:color w:val="FFFFFF"/>
                 <w:sz w:val="18"/>
               </w:rPr>
               <w:t>UC-4  ·  VDI Compliance Risk</w:t>
@@ -1035,19 +1029,19 @@
         <w:tc>
           <w:tcPr>
             <w:tcW w:w="4896" w:type="dxa"/>
-            <w:shd w:val="clear" w:color="auto" w:fill="FDECEA"/>
-          </w:tcPr>
-          <w:p>
-            <w:r>
-              <w:rPr>
-                <w:color w:val="C62828"/>
+            <w:shd w:val="clear" w:color="auto" w:fill="E8F5E9"/>
+          </w:tcPr>
+          <w:p>
+            <w:r>
+              <w:rPr>
+                <w:color w:val="000000"/>
                 <w:sz w:val="18"/>
               </w:rPr>
               <w:t>PROBLEM: VDI noncompliance affects every session user — treated identically to a laptop in most tools.</w:t>
             </w:r>
             <w:r>
               <w:rPr>
-                <w:color w:val="C62828"/>
+                <w:color w:val="000000"/>
                 <w:sz w:val="18"/>
               </w:rPr>
               <w:br/>
@@ -1055,7 +1049,7 @@
             </w:r>
             <w:r>
               <w:rPr>
-                <w:color w:val="C62828"/>
+                <w:color w:val="000000"/>
                 <w:sz w:val="18"/>
               </w:rPr>
               <w:br/>
@@ -1068,13 +1062,13 @@
         <w:tc>
           <w:tcPr>
             <w:tcW w:w="4896" w:type="dxa"/>
-            <w:shd w:val="clear" w:color="auto" w:fill="FDECEA"/>
-          </w:tcPr>
-          <w:p>
-            <w:r>
-              <w:rPr>
-                <w:b/>
-                <w:color w:val="C62828"/>
+            <w:shd w:val="clear" w:color="auto" w:fill="1B5E20"/>
+          </w:tcPr>
+          <w:p>
+            <w:r>
+              <w:rPr>
+                <w:b/>
+                <w:color w:val="FFFFFF"/>
                 <w:sz w:val="18"/>
               </w:rPr>
               <w:t>UC-5  ·  BYOD Risk Segmentation</w:t>
@@ -1084,19 +1078,19 @@
         <w:tc>
           <w:tcPr>
             <w:tcW w:w="4896" w:type="dxa"/>
-            <w:shd w:val="clear" w:color="auto" w:fill="FDECEA"/>
-          </w:tcPr>
-          <w:p>
-            <w:r>
-              <w:rPr>
-                <w:color w:val="C62828"/>
+            <w:shd w:val="clear" w:color="auto" w:fill="E8F5E9"/>
+          </w:tcPr>
+          <w:p>
+            <w:r>
+              <w:rPr>
+                <w:color w:val="000000"/>
                 <w:sz w:val="18"/>
               </w:rPr>
               <w:t>PROBLEM: BYOD devices treated identically to corporate laptops in most compliance reporting.</w:t>
             </w:r>
             <w:r>
               <w:rPr>
-                <w:color w:val="C62828"/>
+                <w:color w:val="000000"/>
                 <w:sz w:val="18"/>
               </w:rPr>
               <w:br/>
@@ -1104,7 +1098,7 @@
             </w:r>
             <w:r>
               <w:rPr>
-                <w:color w:val="C62828"/>
+                <w:color w:val="000000"/>
                 <w:sz w:val="18"/>
               </w:rPr>
               <w:br/>

</xml_diff>

<commit_message>
Playbook: mark Intune Section A (UC-1–5) as NOT AVAILABLE TODAY (retry)
OneDrive sync clobbered the file before staging in the previous attempt.
Section A header → red (C62828) 'NOT AVAILABLE TODAY'; UC-1–UC-5 rows → light red.

Co-Authored-By: Claude Sonnet 4.6 <noreply@anthropic.com>
</commit_message>
<xml_diff>
--- a/fixes/UAI_Integrations_Playbook.docx
+++ b/fixes/UAI_Integrations_Playbook.docx
@@ -821,16 +821,21 @@
           <w:tcPr>
             <w:tcW w:w="9792" w:type="dxa"/>
             <w:gridSpan w:val="2"/>
-            <w:shd w:val="clear" w:color="auto" w:fill="1B5E20"/>
-          </w:tcPr>
-          <w:p>
-            <w:r>
-              <w:rPr>
+            <w:shd w:val="clear" w:color="auto" w:fill="C62828"/>
+          </w:tcPr>
+          <w:p>
+            <w:pPr>
+              <w:spacing w:before="0" w:after="0"/>
+            </w:pPr>
+            <w:r/>
+            <w:r>
+              <w:rPr>
+                <w:rFonts w:ascii="Calibri" w:hAnsi="Calibri"/>
                 <w:b/>
                 <w:color w:val="FFFFFF"/>
-                <w:sz w:val="20"/>
-              </w:rPr>
-              <w:t>SECTION A  —  AVAILABLE TODAY</w:t>
+                <w:sz w:val="18"/>
+              </w:rPr>
+              <w:t>SECTION A  —  NOT AVAILABLE TODAY</w:t>
             </w:r>
           </w:p>
         </w:tc>
@@ -839,13 +844,13 @@
         <w:tc>
           <w:tcPr>
             <w:tcW w:w="4896" w:type="dxa"/>
-            <w:shd w:val="clear" w:color="auto" w:fill="1B5E20"/>
-          </w:tcPr>
-          <w:p>
-            <w:r>
-              <w:rPr>
-                <w:b/>
-                <w:color w:val="FFFFFF"/>
+            <w:shd w:val="clear" w:color="auto" w:fill="FDECEA"/>
+          </w:tcPr>
+          <w:p>
+            <w:r>
+              <w:rPr>
+                <w:b/>
+                <w:color w:val="C62828"/>
                 <w:sz w:val="18"/>
               </w:rPr>
               <w:t>UC-1  ·  MDM Compliance</w:t>
@@ -853,7 +858,7 @@
             <w:r>
               <w:rPr>
                 <w:b/>
-                <w:color w:val="FFFFFF"/>
+                <w:color w:val="C62828"/>
                 <w:sz w:val="18"/>
               </w:rPr>
               <w:br/>
@@ -864,19 +869,19 @@
         <w:tc>
           <w:tcPr>
             <w:tcW w:w="4896" w:type="dxa"/>
-            <w:shd w:val="clear" w:color="auto" w:fill="E8F5E9"/>
-          </w:tcPr>
-          <w:p>
-            <w:r>
-              <w:rPr>
-                <w:color w:val="000000"/>
+            <w:shd w:val="clear" w:color="auto" w:fill="FDECEA"/>
+          </w:tcPr>
+          <w:p>
+            <w:r>
+              <w:rPr>
+                <w:color w:val="C62828"/>
                 <w:sz w:val="18"/>
               </w:rPr>
               <w:t>PROBLEM: Security teams can't quickly answer how many devices are out of policy, what type, or which site.</w:t>
             </w:r>
             <w:r>
               <w:rPr>
-                <w:color w:val="000000"/>
+                <w:color w:val="C62828"/>
                 <w:sz w:val="18"/>
               </w:rPr>
               <w:br/>
@@ -884,7 +889,7 @@
             </w:r>
             <w:r>
               <w:rPr>
-                <w:color w:val="000000"/>
+                <w:color w:val="C62828"/>
                 <w:sz w:val="18"/>
               </w:rPr>
               <w:br/>
@@ -897,13 +902,13 @@
         <w:tc>
           <w:tcPr>
             <w:tcW w:w="4896" w:type="dxa"/>
-            <w:shd w:val="clear" w:color="auto" w:fill="1B5E20"/>
-          </w:tcPr>
-          <w:p>
-            <w:r>
-              <w:rPr>
-                <w:b/>
-                <w:color w:val="FFFFFF"/>
+            <w:shd w:val="clear" w:color="auto" w:fill="FDECEA"/>
+          </w:tcPr>
+          <w:p>
+            <w:r>
+              <w:rPr>
+                <w:b/>
+                <w:color w:val="C62828"/>
                 <w:sz w:val="18"/>
               </w:rPr>
               <w:t>UC-2  ·  Grace Period</w:t>
@@ -911,7 +916,7 @@
             <w:r>
               <w:rPr>
                 <w:b/>
-                <w:color w:val="FFFFFF"/>
+                <w:color w:val="C62828"/>
                 <w:sz w:val="18"/>
               </w:rPr>
               <w:br/>
@@ -922,19 +927,19 @@
         <w:tc>
           <w:tcPr>
             <w:tcW w:w="4896" w:type="dxa"/>
-            <w:shd w:val="clear" w:color="auto" w:fill="E8F5E9"/>
-          </w:tcPr>
-          <w:p>
-            <w:r>
-              <w:rPr>
-                <w:color w:val="000000"/>
+            <w:shd w:val="clear" w:color="auto" w:fill="FDECEA"/>
+          </w:tcPr>
+          <w:p>
+            <w:r>
+              <w:rPr>
+                <w:color w:val="C62828"/>
                 <w:sz w:val="18"/>
               </w:rPr>
               <w:t>PROBLEM: IT teams miss grace period expiry — devices silently lose access with no live operational view.</w:t>
             </w:r>
             <w:r>
               <w:rPr>
-                <w:color w:val="000000"/>
+                <w:color w:val="C62828"/>
                 <w:sz w:val="18"/>
               </w:rPr>
               <w:br/>
@@ -942,7 +947,7 @@
             </w:r>
             <w:r>
               <w:rPr>
-                <w:color w:val="000000"/>
+                <w:color w:val="C62828"/>
                 <w:sz w:val="18"/>
               </w:rPr>
               <w:br/>
@@ -955,13 +960,13 @@
         <w:tc>
           <w:tcPr>
             <w:tcW w:w="4896" w:type="dxa"/>
-            <w:shd w:val="clear" w:color="auto" w:fill="1B5E20"/>
-          </w:tcPr>
-          <w:p>
-            <w:r>
-              <w:rPr>
-                <w:b/>
-                <w:color w:val="FFFFFF"/>
+            <w:shd w:val="clear" w:color="auto" w:fill="FDECEA"/>
+          </w:tcPr>
+          <w:p>
+            <w:r>
+              <w:rPr>
+                <w:b/>
+                <w:color w:val="C62828"/>
                 <w:sz w:val="18"/>
               </w:rPr>
               <w:t>UC-3  ·  Cross-vendor Correlation</w:t>
@@ -969,7 +974,7 @@
             <w:r>
               <w:rPr>
                 <w:b/>
-                <w:color w:val="FFFFFF"/>
+                <w:color w:val="C62828"/>
                 <w:sz w:val="18"/>
               </w:rPr>
               <w:br/>
@@ -980,19 +985,19 @@
         <w:tc>
           <w:tcPr>
             <w:tcW w:w="4896" w:type="dxa"/>
-            <w:shd w:val="clear" w:color="auto" w:fill="E8F5E9"/>
-          </w:tcPr>
-          <w:p>
-            <w:r>
-              <w:rPr>
-                <w:color w:val="000000"/>
+            <w:shd w:val="clear" w:color="auto" w:fill="FDECEA"/>
+          </w:tcPr>
+          <w:p>
+            <w:r>
+              <w:rPr>
+                <w:color w:val="C62828"/>
                 <w:sz w:val="18"/>
               </w:rPr>
               <w:t>PROBLEM: MDM noncompliance and EDR threat posture tracked in separate consoles — manual cross-reference required.</w:t>
             </w:r>
             <w:r>
               <w:rPr>
-                <w:color w:val="000000"/>
+                <w:color w:val="C62828"/>
                 <w:sz w:val="18"/>
               </w:rPr>
               <w:br/>
@@ -1000,7 +1005,7 @@
             </w:r>
             <w:r>
               <w:rPr>
-                <w:color w:val="000000"/>
+                <w:color w:val="C62828"/>
                 <w:sz w:val="18"/>
               </w:rPr>
               <w:br/>
@@ -1013,13 +1018,13 @@
         <w:tc>
           <w:tcPr>
             <w:tcW w:w="4896" w:type="dxa"/>
-            <w:shd w:val="clear" w:color="auto" w:fill="1B5E20"/>
-          </w:tcPr>
-          <w:p>
-            <w:r>
-              <w:rPr>
-                <w:b/>
-                <w:color w:val="FFFFFF"/>
+            <w:shd w:val="clear" w:color="auto" w:fill="FDECEA"/>
+          </w:tcPr>
+          <w:p>
+            <w:r>
+              <w:rPr>
+                <w:b/>
+                <w:color w:val="C62828"/>
                 <w:sz w:val="18"/>
               </w:rPr>
               <w:t>UC-4  ·  VDI Compliance Risk</w:t>
@@ -1029,19 +1034,19 @@
         <w:tc>
           <w:tcPr>
             <w:tcW w:w="4896" w:type="dxa"/>
-            <w:shd w:val="clear" w:color="auto" w:fill="E8F5E9"/>
-          </w:tcPr>
-          <w:p>
-            <w:r>
-              <w:rPr>
-                <w:color w:val="000000"/>
+            <w:shd w:val="clear" w:color="auto" w:fill="FDECEA"/>
+          </w:tcPr>
+          <w:p>
+            <w:r>
+              <w:rPr>
+                <w:color w:val="C62828"/>
                 <w:sz w:val="18"/>
               </w:rPr>
               <w:t>PROBLEM: VDI noncompliance affects every session user — treated identically to a laptop in most tools.</w:t>
             </w:r>
             <w:r>
               <w:rPr>
-                <w:color w:val="000000"/>
+                <w:color w:val="C62828"/>
                 <w:sz w:val="18"/>
               </w:rPr>
               <w:br/>
@@ -1049,7 +1054,7 @@
             </w:r>
             <w:r>
               <w:rPr>
-                <w:color w:val="000000"/>
+                <w:color w:val="C62828"/>
                 <w:sz w:val="18"/>
               </w:rPr>
               <w:br/>
@@ -1062,13 +1067,13 @@
         <w:tc>
           <w:tcPr>
             <w:tcW w:w="4896" w:type="dxa"/>
-            <w:shd w:val="clear" w:color="auto" w:fill="1B5E20"/>
-          </w:tcPr>
-          <w:p>
-            <w:r>
-              <w:rPr>
-                <w:b/>
-                <w:color w:val="FFFFFF"/>
+            <w:shd w:val="clear" w:color="auto" w:fill="FDECEA"/>
+          </w:tcPr>
+          <w:p>
+            <w:r>
+              <w:rPr>
+                <w:b/>
+                <w:color w:val="C62828"/>
                 <w:sz w:val="18"/>
               </w:rPr>
               <w:t>UC-5  ·  BYOD Risk Segmentation</w:t>
@@ -1078,19 +1083,19 @@
         <w:tc>
           <w:tcPr>
             <w:tcW w:w="4896" w:type="dxa"/>
-            <w:shd w:val="clear" w:color="auto" w:fill="E8F5E9"/>
-          </w:tcPr>
-          <w:p>
-            <w:r>
-              <w:rPr>
-                <w:color w:val="000000"/>
+            <w:shd w:val="clear" w:color="auto" w:fill="FDECEA"/>
+          </w:tcPr>
+          <w:p>
+            <w:r>
+              <w:rPr>
+                <w:color w:val="C62828"/>
                 <w:sz w:val="18"/>
               </w:rPr>
               <w:t>PROBLEM: BYOD devices treated identically to corporate laptops in most compliance reporting.</w:t>
             </w:r>
             <w:r>
               <w:rPr>
-                <w:color w:val="000000"/>
+                <w:color w:val="C62828"/>
                 <w:sz w:val="18"/>
               </w:rPr>
               <w:br/>
@@ -1098,7 +1103,7 @@
             </w:r>
             <w:r>
               <w:rPr>
-                <w:color w:val="000000"/>
+                <w:color w:val="C62828"/>
                 <w:sz w:val="18"/>
               </w:rPr>
               <w:br/>

</xml_diff>

<commit_message>
Revert "Playbook: mark Intune Section A (UC-1–5) as NOT AVAILABLE TODAY (retry)"
This reverts commit 5c00048946ce159ec3349908e4e9aa54f8660645.
</commit_message>
<xml_diff>
--- a/fixes/UAI_Integrations_Playbook.docx
+++ b/fixes/UAI_Integrations_Playbook.docx
@@ -821,21 +821,16 @@
           <w:tcPr>
             <w:tcW w:w="9792" w:type="dxa"/>
             <w:gridSpan w:val="2"/>
-            <w:shd w:val="clear" w:color="auto" w:fill="C62828"/>
-          </w:tcPr>
-          <w:p>
-            <w:pPr>
-              <w:spacing w:before="0" w:after="0"/>
-            </w:pPr>
-            <w:r/>
-            <w:r>
-              <w:rPr>
-                <w:rFonts w:ascii="Calibri" w:hAnsi="Calibri"/>
+            <w:shd w:val="clear" w:color="auto" w:fill="1B5E20"/>
+          </w:tcPr>
+          <w:p>
+            <w:r>
+              <w:rPr>
                 <w:b/>
                 <w:color w:val="FFFFFF"/>
-                <w:sz w:val="18"/>
-              </w:rPr>
-              <w:t>SECTION A  —  NOT AVAILABLE TODAY</w:t>
+                <w:sz w:val="20"/>
+              </w:rPr>
+              <w:t>SECTION A  —  AVAILABLE TODAY</w:t>
             </w:r>
           </w:p>
         </w:tc>
@@ -844,13 +839,13 @@
         <w:tc>
           <w:tcPr>
             <w:tcW w:w="4896" w:type="dxa"/>
-            <w:shd w:val="clear" w:color="auto" w:fill="FDECEA"/>
-          </w:tcPr>
-          <w:p>
-            <w:r>
-              <w:rPr>
-                <w:b/>
-                <w:color w:val="C62828"/>
+            <w:shd w:val="clear" w:color="auto" w:fill="1B5E20"/>
+          </w:tcPr>
+          <w:p>
+            <w:r>
+              <w:rPr>
+                <w:b/>
+                <w:color w:val="FFFFFF"/>
                 <w:sz w:val="18"/>
               </w:rPr>
               <w:t>UC-1  ·  MDM Compliance</w:t>
@@ -858,7 +853,7 @@
             <w:r>
               <w:rPr>
                 <w:b/>
-                <w:color w:val="C62828"/>
+                <w:color w:val="FFFFFF"/>
                 <w:sz w:val="18"/>
               </w:rPr>
               <w:br/>
@@ -869,19 +864,19 @@
         <w:tc>
           <w:tcPr>
             <w:tcW w:w="4896" w:type="dxa"/>
-            <w:shd w:val="clear" w:color="auto" w:fill="FDECEA"/>
-          </w:tcPr>
-          <w:p>
-            <w:r>
-              <w:rPr>
-                <w:color w:val="C62828"/>
+            <w:shd w:val="clear" w:color="auto" w:fill="E8F5E9"/>
+          </w:tcPr>
+          <w:p>
+            <w:r>
+              <w:rPr>
+                <w:color w:val="000000"/>
                 <w:sz w:val="18"/>
               </w:rPr>
               <w:t>PROBLEM: Security teams can't quickly answer how many devices are out of policy, what type, or which site.</w:t>
             </w:r>
             <w:r>
               <w:rPr>
-                <w:color w:val="C62828"/>
+                <w:color w:val="000000"/>
                 <w:sz w:val="18"/>
               </w:rPr>
               <w:br/>
@@ -889,7 +884,7 @@
             </w:r>
             <w:r>
               <w:rPr>
-                <w:color w:val="C62828"/>
+                <w:color w:val="000000"/>
                 <w:sz w:val="18"/>
               </w:rPr>
               <w:br/>
@@ -902,13 +897,13 @@
         <w:tc>
           <w:tcPr>
             <w:tcW w:w="4896" w:type="dxa"/>
-            <w:shd w:val="clear" w:color="auto" w:fill="FDECEA"/>
-          </w:tcPr>
-          <w:p>
-            <w:r>
-              <w:rPr>
-                <w:b/>
-                <w:color w:val="C62828"/>
+            <w:shd w:val="clear" w:color="auto" w:fill="1B5E20"/>
+          </w:tcPr>
+          <w:p>
+            <w:r>
+              <w:rPr>
+                <w:b/>
+                <w:color w:val="FFFFFF"/>
                 <w:sz w:val="18"/>
               </w:rPr>
               <w:t>UC-2  ·  Grace Period</w:t>
@@ -916,7 +911,7 @@
             <w:r>
               <w:rPr>
                 <w:b/>
-                <w:color w:val="C62828"/>
+                <w:color w:val="FFFFFF"/>
                 <w:sz w:val="18"/>
               </w:rPr>
               <w:br/>
@@ -927,19 +922,19 @@
         <w:tc>
           <w:tcPr>
             <w:tcW w:w="4896" w:type="dxa"/>
-            <w:shd w:val="clear" w:color="auto" w:fill="FDECEA"/>
-          </w:tcPr>
-          <w:p>
-            <w:r>
-              <w:rPr>
-                <w:color w:val="C62828"/>
+            <w:shd w:val="clear" w:color="auto" w:fill="E8F5E9"/>
+          </w:tcPr>
+          <w:p>
+            <w:r>
+              <w:rPr>
+                <w:color w:val="000000"/>
                 <w:sz w:val="18"/>
               </w:rPr>
               <w:t>PROBLEM: IT teams miss grace period expiry — devices silently lose access with no live operational view.</w:t>
             </w:r>
             <w:r>
               <w:rPr>
-                <w:color w:val="C62828"/>
+                <w:color w:val="000000"/>
                 <w:sz w:val="18"/>
               </w:rPr>
               <w:br/>
@@ -947,7 +942,7 @@
             </w:r>
             <w:r>
               <w:rPr>
-                <w:color w:val="C62828"/>
+                <w:color w:val="000000"/>
                 <w:sz w:val="18"/>
               </w:rPr>
               <w:br/>
@@ -960,13 +955,13 @@
         <w:tc>
           <w:tcPr>
             <w:tcW w:w="4896" w:type="dxa"/>
-            <w:shd w:val="clear" w:color="auto" w:fill="FDECEA"/>
-          </w:tcPr>
-          <w:p>
-            <w:r>
-              <w:rPr>
-                <w:b/>
-                <w:color w:val="C62828"/>
+            <w:shd w:val="clear" w:color="auto" w:fill="1B5E20"/>
+          </w:tcPr>
+          <w:p>
+            <w:r>
+              <w:rPr>
+                <w:b/>
+                <w:color w:val="FFFFFF"/>
                 <w:sz w:val="18"/>
               </w:rPr>
               <w:t>UC-3  ·  Cross-vendor Correlation</w:t>
@@ -974,7 +969,7 @@
             <w:r>
               <w:rPr>
                 <w:b/>
-                <w:color w:val="C62828"/>
+                <w:color w:val="FFFFFF"/>
                 <w:sz w:val="18"/>
               </w:rPr>
               <w:br/>
@@ -985,19 +980,19 @@
         <w:tc>
           <w:tcPr>
             <w:tcW w:w="4896" w:type="dxa"/>
-            <w:shd w:val="clear" w:color="auto" w:fill="FDECEA"/>
-          </w:tcPr>
-          <w:p>
-            <w:r>
-              <w:rPr>
-                <w:color w:val="C62828"/>
+            <w:shd w:val="clear" w:color="auto" w:fill="E8F5E9"/>
+          </w:tcPr>
+          <w:p>
+            <w:r>
+              <w:rPr>
+                <w:color w:val="000000"/>
                 <w:sz w:val="18"/>
               </w:rPr>
               <w:t>PROBLEM: MDM noncompliance and EDR threat posture tracked in separate consoles — manual cross-reference required.</w:t>
             </w:r>
             <w:r>
               <w:rPr>
-                <w:color w:val="C62828"/>
+                <w:color w:val="000000"/>
                 <w:sz w:val="18"/>
               </w:rPr>
               <w:br/>
@@ -1005,7 +1000,7 @@
             </w:r>
             <w:r>
               <w:rPr>
-                <w:color w:val="C62828"/>
+                <w:color w:val="000000"/>
                 <w:sz w:val="18"/>
               </w:rPr>
               <w:br/>
@@ -1018,13 +1013,13 @@
         <w:tc>
           <w:tcPr>
             <w:tcW w:w="4896" w:type="dxa"/>
-            <w:shd w:val="clear" w:color="auto" w:fill="FDECEA"/>
-          </w:tcPr>
-          <w:p>
-            <w:r>
-              <w:rPr>
-                <w:b/>
-                <w:color w:val="C62828"/>
+            <w:shd w:val="clear" w:color="auto" w:fill="1B5E20"/>
+          </w:tcPr>
+          <w:p>
+            <w:r>
+              <w:rPr>
+                <w:b/>
+                <w:color w:val="FFFFFF"/>
                 <w:sz w:val="18"/>
               </w:rPr>
               <w:t>UC-4  ·  VDI Compliance Risk</w:t>
@@ -1034,19 +1029,19 @@
         <w:tc>
           <w:tcPr>
             <w:tcW w:w="4896" w:type="dxa"/>
-            <w:shd w:val="clear" w:color="auto" w:fill="FDECEA"/>
-          </w:tcPr>
-          <w:p>
-            <w:r>
-              <w:rPr>
-                <w:color w:val="C62828"/>
+            <w:shd w:val="clear" w:color="auto" w:fill="E8F5E9"/>
+          </w:tcPr>
+          <w:p>
+            <w:r>
+              <w:rPr>
+                <w:color w:val="000000"/>
                 <w:sz w:val="18"/>
               </w:rPr>
               <w:t>PROBLEM: VDI noncompliance affects every session user — treated identically to a laptop in most tools.</w:t>
             </w:r>
             <w:r>
               <w:rPr>
-                <w:color w:val="C62828"/>
+                <w:color w:val="000000"/>
                 <w:sz w:val="18"/>
               </w:rPr>
               <w:br/>
@@ -1054,7 +1049,7 @@
             </w:r>
             <w:r>
               <w:rPr>
-                <w:color w:val="C62828"/>
+                <w:color w:val="000000"/>
                 <w:sz w:val="18"/>
               </w:rPr>
               <w:br/>
@@ -1067,13 +1062,13 @@
         <w:tc>
           <w:tcPr>
             <w:tcW w:w="4896" w:type="dxa"/>
-            <w:shd w:val="clear" w:color="auto" w:fill="FDECEA"/>
-          </w:tcPr>
-          <w:p>
-            <w:r>
-              <w:rPr>
-                <w:b/>
-                <w:color w:val="C62828"/>
+            <w:shd w:val="clear" w:color="auto" w:fill="1B5E20"/>
+          </w:tcPr>
+          <w:p>
+            <w:r>
+              <w:rPr>
+                <w:b/>
+                <w:color w:val="FFFFFF"/>
                 <w:sz w:val="18"/>
               </w:rPr>
               <w:t>UC-5  ·  BYOD Risk Segmentation</w:t>
@@ -1083,19 +1078,19 @@
         <w:tc>
           <w:tcPr>
             <w:tcW w:w="4896" w:type="dxa"/>
-            <w:shd w:val="clear" w:color="auto" w:fill="FDECEA"/>
-          </w:tcPr>
-          <w:p>
-            <w:r>
-              <w:rPr>
-                <w:color w:val="C62828"/>
+            <w:shd w:val="clear" w:color="auto" w:fill="E8F5E9"/>
+          </w:tcPr>
+          <w:p>
+            <w:r>
+              <w:rPr>
+                <w:color w:val="000000"/>
                 <w:sz w:val="18"/>
               </w:rPr>
               <w:t>PROBLEM: BYOD devices treated identically to corporate laptops in most compliance reporting.</w:t>
             </w:r>
             <w:r>
               <w:rPr>
-                <w:color w:val="C62828"/>
+                <w:color w:val="000000"/>
                 <w:sz w:val="18"/>
               </w:rPr>
               <w:br/>
@@ -1103,7 +1098,7 @@
             </w:r>
             <w:r>
               <w:rPr>
-                <w:color w:val="C62828"/>
+                <w:color w:val="000000"/>
                 <w:sz w:val="18"/>
               </w:rPr>
               <w:br/>

</xml_diff>